<commit_message>
update local_reference.docx - front page table design change
</commit_message>
<xml_diff>
--- a/local_reference.docx
+++ b/local_reference.docx
@@ -1,6 +1,6 @@
 
 <file path=word/document.xml><?xml version="1.0" encoding="utf-8"?>
-<w:document xmlns:wpc="http://schemas.microsoft.com/office/word/2010/wordprocessingCanvas" xmlns:cx="http://schemas.microsoft.com/office/drawing/2014/chartex" xmlns:cx1="http://schemas.microsoft.com/office/drawing/2015/9/8/chartex" xmlns:cx2="http://schemas.microsoft.com/office/drawing/2015/10/21/chartex" xmlns:cx3="http://schemas.microsoft.com/office/drawing/2016/5/9/chartex" xmlns:cx4="http://schemas.microsoft.com/office/drawing/2016/5/10/chartex" xmlns:cx5="http://schemas.microsoft.com/office/drawing/2016/5/11/chartex" xmlns:cx6="http://schemas.microsoft.com/office/drawing/2016/5/12/chartex" xmlns:cx7="http://schemas.microsoft.com/office/drawing/2016/5/13/chartex" xmlns:cx8="http://schemas.microsoft.com/office/drawing/2016/5/14/chartex" xmlns:mc="http://schemas.openxmlformats.org/markup-compatibility/2006" xmlns:aink="http://schemas.microsoft.com/office/drawing/2016/ink" xmlns:am3d="http://schemas.microsoft.com/office/drawing/2017/model3d" xmlns:o="urn:schemas-microsoft-com:office:office" xmlns:oel="http://schemas.microsoft.com/office/2019/extlst" xmlns:r="http://schemas.openxmlformats.org/officeDocument/2006/relationships" xmlns:m="http://schemas.openxmlformats.org/officeDocument/2006/math" xmlns:v="urn:schemas-microsoft-com:vml" xmlns:wp14="http://schemas.microsoft.com/office/word/2010/wordprocessingDrawing" xmlns:wp="http://schemas.openxmlformats.org/drawingml/2006/wordprocessingDrawing" xmlns:w10="urn:schemas-microsoft-com:office:word" xmlns:w="http://schemas.openxmlformats.org/wordprocessingml/2006/main" xmlns:w14="http://schemas.microsoft.com/office/word/2010/wordml" xmlns:w15="http://schemas.microsoft.com/office/word/2012/wordml" xmlns:w16cex="http://schemas.microsoft.com/office/word/2018/wordml/cex" xmlns:w16cid="http://schemas.microsoft.com/office/word/2016/wordml/cid" xmlns:w16="http://schemas.microsoft.com/office/word/2018/wordml" xmlns:w16du="http://schemas.microsoft.com/office/word/2023/wordml/word16du" xmlns:w16sdtdh="http://schemas.microsoft.com/office/word/2020/wordml/sdtdatahash" xmlns:w16se="http://schemas.microsoft.com/office/word/2015/wordml/symex" xmlns:wpg="http://schemas.microsoft.com/office/word/2010/wordprocessingGroup" xmlns:wpi="http://schemas.microsoft.com/office/word/2010/wordprocessingInk" xmlns:wne="http://schemas.microsoft.com/office/word/2006/wordml" xmlns:wps="http://schemas.microsoft.com/office/word/2010/wordprocessingShape" mc:Ignorable="w14 w15 w16se w16cid w16 w16cex w16sdtdh w16du wp14">
+<w:document xmlns:wpc="http://schemas.microsoft.com/office/word/2010/wordprocessingCanvas" xmlns:cx="http://schemas.microsoft.com/office/drawing/2014/chartex" xmlns:cx1="http://schemas.microsoft.com/office/drawing/2015/9/8/chartex" xmlns:cx2="http://schemas.microsoft.com/office/drawing/2015/10/21/chartex" xmlns:cx3="http://schemas.microsoft.com/office/drawing/2016/5/9/chartex" xmlns:cx4="http://schemas.microsoft.com/office/drawing/2016/5/10/chartex" xmlns:cx5="http://schemas.microsoft.com/office/drawing/2016/5/11/chartex" xmlns:cx6="http://schemas.microsoft.com/office/drawing/2016/5/12/chartex" xmlns:cx7="http://schemas.microsoft.com/office/drawing/2016/5/13/chartex" xmlns:cx8="http://schemas.microsoft.com/office/drawing/2016/5/14/chartex" xmlns:mc="http://schemas.openxmlformats.org/markup-compatibility/2006" xmlns:aink="http://schemas.microsoft.com/office/drawing/2016/ink" xmlns:am3d="http://schemas.microsoft.com/office/drawing/2017/model3d" xmlns:o="urn:schemas-microsoft-com:office:office" xmlns:oel="http://schemas.microsoft.com/office/2019/extlst" xmlns:r="http://schemas.openxmlformats.org/officeDocument/2006/relationships" xmlns:m="http://schemas.openxmlformats.org/officeDocument/2006/math" xmlns:v="urn:schemas-microsoft-com:vml" xmlns:wp14="http://schemas.microsoft.com/office/word/2010/wordprocessingDrawing" xmlns:wp="http://schemas.openxmlformats.org/drawingml/2006/wordprocessingDrawing" xmlns:w10="urn:schemas-microsoft-com:office:word" xmlns:w="http://schemas.openxmlformats.org/wordprocessingml/2006/main" xmlns:w14="http://schemas.microsoft.com/office/word/2010/wordml" xmlns:w15="http://schemas.microsoft.com/office/word/2012/wordml" xmlns:w16cex="http://schemas.microsoft.com/office/word/2018/wordml/cex" xmlns:w16cid="http://schemas.microsoft.com/office/word/2016/wordml/cid" xmlns:w16="http://schemas.microsoft.com/office/word/2018/wordml" xmlns:w16du="http://schemas.microsoft.com/office/word/2023/wordml/word16du" xmlns:w16sdtdh="http://schemas.microsoft.com/office/word/2020/wordml/sdtdatahash" xmlns:w16sdtfl="http://schemas.microsoft.com/office/word/2024/wordml/sdtformatlock" xmlns:w16se="http://schemas.microsoft.com/office/word/2015/wordml/symex" xmlns:wpg="http://schemas.microsoft.com/office/word/2010/wordprocessingGroup" xmlns:wpi="http://schemas.microsoft.com/office/word/2010/wordprocessingInk" xmlns:wne="http://schemas.microsoft.com/office/word/2006/wordml" xmlns:wps="http://schemas.microsoft.com/office/word/2010/wordprocessingShape" mc:Ignorable="w14 w15 w16se w16cid w16 w16cex w16sdtdh w16sdtfl w16du wp14">
   <w:body>
     <w:p>
       <w:pPr>
@@ -12,21 +12,11 @@
       <w:r>
         <w:instrText xml:space="preserve">if </w:instrText>
       </w:r>
-      <w:r>
-        <w:fldChar w:fldCharType="begin"/>
-      </w:r>
-      <w:r>
-        <w:instrText xml:space="preserve"> section </w:instrText>
-      </w:r>
-      <w:r>
-        <w:fldChar w:fldCharType="separate"/>
-      </w:r>
-      <w:r>
-        <w:instrText>1</w:instrText>
-      </w:r>
-      <w:r>
-        <w:fldChar w:fldCharType="end"/>
-      </w:r>
+      <w:fldSimple w:instr=" section ">
+        <w:r>
+          <w:instrText>1</w:instrText>
+        </w:r>
+      </w:fldSimple>
       <w:r>
         <w:instrText>="1" "</w:instrText>
       </w:r>
@@ -98,7 +88,7 @@
     <w:sdt>
       <w:sdtPr>
         <w:rPr>
-          <w:rFonts w:ascii="Source Sans Pro" w:eastAsia="Source Han Code JP R" w:hAnsi="Source Han Code JP R" w:cs="Source Han Code JP R"/>
+          <w:rFonts w:ascii="Source Sans Pro" w:eastAsia="源ノ角ゴシック Code JP R" w:hAnsi="源ノ角ゴシック Code JP R" w:cs="源ノ角ゴシック Code JP R"/>
           <w:b/>
           <w:bCs/>
           <w:i/>
@@ -124,7 +114,7 @@
           <w:pPr>
             <w:pStyle w:val="TOC1"/>
             <w:rPr>
-              <w:rFonts w:asciiTheme="minorHAnsi" w:eastAsiaTheme="minorEastAsia" w:hAnsiTheme="minorHAnsi" w:cstheme="minorBidi"/>
+              <w:rFonts w:asciiTheme="minorHAnsi" w:eastAsiaTheme="minorEastAsia" w:hAnsiTheme="minorHAnsi" w:cstheme="minorBidi" w:hint="eastAsia"/>
               <w:noProof/>
               <w:color w:val="auto"/>
               <w:kern w:val="2"/>
@@ -224,7 +214,7 @@
               <w:tab w:val="right" w:leader="dot" w:pos="6872"/>
             </w:tabs>
             <w:rPr>
-              <w:rFonts w:asciiTheme="minorHAnsi" w:eastAsiaTheme="minorEastAsia" w:hAnsiTheme="minorHAnsi" w:cstheme="minorBidi"/>
+              <w:rFonts w:asciiTheme="minorHAnsi" w:eastAsiaTheme="minorEastAsia" w:hAnsiTheme="minorHAnsi" w:cstheme="minorBidi" w:hint="eastAsia"/>
               <w:bCs w:val="0"/>
               <w:noProof/>
               <w:kern w:val="2"/>
@@ -298,7 +288,7 @@
               <w:tab w:val="right" w:leader="dot" w:pos="6872"/>
             </w:tabs>
             <w:rPr>
-              <w:rFonts w:asciiTheme="minorHAnsi" w:eastAsiaTheme="minorEastAsia" w:hAnsiTheme="minorHAnsi" w:cstheme="minorBidi"/>
+              <w:rFonts w:asciiTheme="minorHAnsi" w:eastAsiaTheme="minorEastAsia" w:hAnsiTheme="minorHAnsi" w:cstheme="minorBidi" w:hint="eastAsia"/>
               <w:noProof/>
               <w:kern w:val="2"/>
               <w:sz w:val="22"/>
@@ -369,7 +359,7 @@
           <w:pPr>
             <w:pStyle w:val="TOC1"/>
             <w:rPr>
-              <w:rFonts w:asciiTheme="minorHAnsi" w:eastAsiaTheme="minorEastAsia" w:hAnsiTheme="minorHAnsi" w:cstheme="minorBidi"/>
+              <w:rFonts w:asciiTheme="minorHAnsi" w:eastAsiaTheme="minorEastAsia" w:hAnsiTheme="minorHAnsi" w:cstheme="minorBidi" w:hint="eastAsia"/>
               <w:noProof/>
               <w:color w:val="auto"/>
               <w:kern w:val="2"/>
@@ -481,7 +471,7 @@
               <w:tab w:val="right" w:leader="dot" w:pos="6872"/>
             </w:tabs>
             <w:rPr>
-              <w:rFonts w:asciiTheme="minorHAnsi" w:eastAsiaTheme="minorEastAsia" w:hAnsiTheme="minorHAnsi" w:cstheme="minorBidi"/>
+              <w:rFonts w:asciiTheme="minorHAnsi" w:eastAsiaTheme="minorEastAsia" w:hAnsiTheme="minorHAnsi" w:cstheme="minorBidi" w:hint="eastAsia"/>
               <w:bCs w:val="0"/>
               <w:noProof/>
               <w:kern w:val="2"/>
@@ -591,7 +581,7 @@
               <w:tab w:val="right" w:leader="dot" w:pos="6872"/>
             </w:tabs>
             <w:rPr>
-              <w:rFonts w:asciiTheme="minorHAnsi" w:eastAsiaTheme="minorEastAsia" w:hAnsiTheme="minorHAnsi" w:cstheme="minorBidi"/>
+              <w:rFonts w:asciiTheme="minorHAnsi" w:eastAsiaTheme="minorEastAsia" w:hAnsiTheme="minorHAnsi" w:cstheme="minorBidi" w:hint="eastAsia"/>
               <w:noProof/>
               <w:kern w:val="2"/>
               <w:sz w:val="22"/>
@@ -700,7 +690,7 @@
               <w:tab w:val="left" w:pos="1600"/>
             </w:tabs>
             <w:rPr>
-              <w:rFonts w:asciiTheme="minorHAnsi" w:eastAsiaTheme="minorEastAsia" w:hAnsiTheme="minorHAnsi" w:cstheme="minorBidi"/>
+              <w:rFonts w:asciiTheme="minorHAnsi" w:eastAsiaTheme="minorEastAsia" w:hAnsiTheme="minorHAnsi" w:cstheme="minorBidi" w:hint="eastAsia"/>
               <w:noProof/>
               <w:color w:val="auto"/>
               <w:kern w:val="2"/>
@@ -812,7 +802,7 @@
               <w:tab w:val="right" w:leader="dot" w:pos="6872"/>
             </w:tabs>
             <w:rPr>
-              <w:rFonts w:asciiTheme="minorHAnsi" w:eastAsiaTheme="minorEastAsia" w:hAnsiTheme="minorHAnsi" w:cstheme="minorBidi"/>
+              <w:rFonts w:asciiTheme="minorHAnsi" w:eastAsiaTheme="minorEastAsia" w:hAnsiTheme="minorHAnsi" w:cstheme="minorBidi" w:hint="eastAsia"/>
               <w:bCs w:val="0"/>
               <w:noProof/>
               <w:kern w:val="2"/>
@@ -922,7 +912,7 @@
               <w:tab w:val="right" w:leader="dot" w:pos="6872"/>
             </w:tabs>
             <w:rPr>
-              <w:rFonts w:asciiTheme="minorHAnsi" w:eastAsiaTheme="minorEastAsia" w:hAnsiTheme="minorHAnsi" w:cstheme="minorBidi"/>
+              <w:rFonts w:asciiTheme="minorHAnsi" w:eastAsiaTheme="minorEastAsia" w:hAnsiTheme="minorHAnsi" w:cstheme="minorBidi" w:hint="eastAsia"/>
               <w:noProof/>
               <w:kern w:val="2"/>
               <w:sz w:val="22"/>
@@ -2023,9 +2013,6 @@
         <w:tc>
           <w:tcPr>
             <w:tcW w:w="0" w:type="auto"/>
-            <w:tcBorders>
-              <w:bottom w:val="single" w:sz="0" w:space="0" w:color="auto"/>
-            </w:tcBorders>
             <w:vAlign w:val="center"/>
           </w:tcPr>
           <w:p>
@@ -2049,9 +2036,6 @@
         <w:tc>
           <w:tcPr>
             <w:tcW w:w="0" w:type="auto"/>
-            <w:tcBorders>
-              <w:bottom w:val="single" w:sz="0" w:space="0" w:color="auto"/>
-            </w:tcBorders>
             <w:vAlign w:val="center"/>
           </w:tcPr>
           <w:p>
@@ -2076,9 +2060,6 @@
         <w:tc>
           <w:tcPr>
             <w:tcW w:w="0" w:type="auto"/>
-            <w:tcBorders>
-              <w:bottom w:val="single" w:sz="0" w:space="0" w:color="auto"/>
-            </w:tcBorders>
             <w:vAlign w:val="center"/>
           </w:tcPr>
           <w:p>
@@ -2093,9 +2074,6 @@
         <w:tc>
           <w:tcPr>
             <w:tcW w:w="0" w:type="auto"/>
-            <w:tcBorders>
-              <w:bottom w:val="single" w:sz="0" w:space="0" w:color="auto"/>
-            </w:tcBorders>
             <w:vAlign w:val="center"/>
           </w:tcPr>
           <w:p>
@@ -2110,9 +2088,6 @@
         <w:tc>
           <w:tcPr>
             <w:tcW w:w="0" w:type="auto"/>
-            <w:tcBorders>
-              <w:bottom w:val="single" w:sz="0" w:space="0" w:color="auto"/>
-            </w:tcBorders>
             <w:vAlign w:val="center"/>
           </w:tcPr>
           <w:p>
@@ -2127,9 +2102,6 @@
         <w:tc>
           <w:tcPr>
             <w:tcW w:w="0" w:type="auto"/>
-            <w:tcBorders>
-              <w:bottom w:val="single" w:sz="0" w:space="0" w:color="auto"/>
-            </w:tcBorders>
             <w:vAlign w:val="center"/>
           </w:tcPr>
           <w:p>
@@ -2144,9 +2116,6 @@
         <w:tc>
           <w:tcPr>
             <w:tcW w:w="0" w:type="auto"/>
-            <w:tcBorders>
-              <w:bottom w:val="single" w:sz="0" w:space="0" w:color="auto"/>
-            </w:tcBorders>
             <w:vAlign w:val="center"/>
           </w:tcPr>
           <w:p>
@@ -5308,9 +5277,6 @@
         <w:tc>
           <w:tcPr>
             <w:tcW w:w="0" w:type="auto"/>
-            <w:tcBorders>
-              <w:bottom w:val="single" w:sz="0" w:space="0" w:color="auto"/>
-            </w:tcBorders>
             <w:vAlign w:val="center"/>
           </w:tcPr>
           <w:p>
@@ -5325,9 +5291,6 @@
         <w:tc>
           <w:tcPr>
             <w:tcW w:w="0" w:type="auto"/>
-            <w:tcBorders>
-              <w:bottom w:val="single" w:sz="0" w:space="0" w:color="auto"/>
-            </w:tcBorders>
             <w:vAlign w:val="center"/>
           </w:tcPr>
           <w:p>
@@ -5343,9 +5306,6 @@
           <w:tcPr>
             <w:cnfStyle w:val="000100000000" w:firstRow="0" w:lastRow="0" w:firstColumn="0" w:lastColumn="1" w:oddVBand="0" w:evenVBand="0" w:oddHBand="0" w:evenHBand="0" w:firstRowFirstColumn="0" w:firstRowLastColumn="0" w:lastRowFirstColumn="0" w:lastRowLastColumn="0"/>
             <w:tcW w:w="0" w:type="auto"/>
-            <w:tcBorders>
-              <w:bottom w:val="single" w:sz="0" w:space="0" w:color="auto"/>
-            </w:tcBorders>
             <w:vAlign w:val="center"/>
           </w:tcPr>
           <w:p>
@@ -5532,7 +5492,7 @@
 </file>
 
 <file path=word/endnotes.xml><?xml version="1.0" encoding="utf-8"?>
-<w:endnotes xmlns:wpc="http://schemas.microsoft.com/office/word/2010/wordprocessingCanvas" xmlns:cx="http://schemas.microsoft.com/office/drawing/2014/chartex" xmlns:cx1="http://schemas.microsoft.com/office/drawing/2015/9/8/chartex" xmlns:cx2="http://schemas.microsoft.com/office/drawing/2015/10/21/chartex" xmlns:cx3="http://schemas.microsoft.com/office/drawing/2016/5/9/chartex" xmlns:cx4="http://schemas.microsoft.com/office/drawing/2016/5/10/chartex" xmlns:cx5="http://schemas.microsoft.com/office/drawing/2016/5/11/chartex" xmlns:cx6="http://schemas.microsoft.com/office/drawing/2016/5/12/chartex" xmlns:cx7="http://schemas.microsoft.com/office/drawing/2016/5/13/chartex" xmlns:cx8="http://schemas.microsoft.com/office/drawing/2016/5/14/chartex" xmlns:mc="http://schemas.openxmlformats.org/markup-compatibility/2006" xmlns:aink="http://schemas.microsoft.com/office/drawing/2016/ink" xmlns:am3d="http://schemas.microsoft.com/office/drawing/2017/model3d" xmlns:o="urn:schemas-microsoft-com:office:office" xmlns:oel="http://schemas.microsoft.com/office/2019/extlst" xmlns:r="http://schemas.openxmlformats.org/officeDocument/2006/relationships" xmlns:m="http://schemas.openxmlformats.org/officeDocument/2006/math" xmlns:v="urn:schemas-microsoft-com:vml" xmlns:wp14="http://schemas.microsoft.com/office/word/2010/wordprocessingDrawing" xmlns:wp="http://schemas.openxmlformats.org/drawingml/2006/wordprocessingDrawing" xmlns:w10="urn:schemas-microsoft-com:office:word" xmlns:w="http://schemas.openxmlformats.org/wordprocessingml/2006/main" xmlns:w14="http://schemas.microsoft.com/office/word/2010/wordml" xmlns:w15="http://schemas.microsoft.com/office/word/2012/wordml" xmlns:w16cex="http://schemas.microsoft.com/office/word/2018/wordml/cex" xmlns:w16cid="http://schemas.microsoft.com/office/word/2016/wordml/cid" xmlns:w16="http://schemas.microsoft.com/office/word/2018/wordml" xmlns:w16du="http://schemas.microsoft.com/office/word/2023/wordml/word16du" xmlns:w16sdtdh="http://schemas.microsoft.com/office/word/2020/wordml/sdtdatahash" xmlns:w16se="http://schemas.microsoft.com/office/word/2015/wordml/symex" xmlns:wpg="http://schemas.microsoft.com/office/word/2010/wordprocessingGroup" xmlns:wpi="http://schemas.microsoft.com/office/word/2010/wordprocessingInk" xmlns:wne="http://schemas.microsoft.com/office/word/2006/wordml" xmlns:wps="http://schemas.microsoft.com/office/word/2010/wordprocessingShape" mc:Ignorable="w14 w15 w16se w16cid w16 w16cex w16sdtdh w16du wp14">
+<w:endnotes xmlns:wpc="http://schemas.microsoft.com/office/word/2010/wordprocessingCanvas" xmlns:cx="http://schemas.microsoft.com/office/drawing/2014/chartex" xmlns:cx1="http://schemas.microsoft.com/office/drawing/2015/9/8/chartex" xmlns:cx2="http://schemas.microsoft.com/office/drawing/2015/10/21/chartex" xmlns:cx3="http://schemas.microsoft.com/office/drawing/2016/5/9/chartex" xmlns:cx4="http://schemas.microsoft.com/office/drawing/2016/5/10/chartex" xmlns:cx5="http://schemas.microsoft.com/office/drawing/2016/5/11/chartex" xmlns:cx6="http://schemas.microsoft.com/office/drawing/2016/5/12/chartex" xmlns:cx7="http://schemas.microsoft.com/office/drawing/2016/5/13/chartex" xmlns:cx8="http://schemas.microsoft.com/office/drawing/2016/5/14/chartex" xmlns:mc="http://schemas.openxmlformats.org/markup-compatibility/2006" xmlns:aink="http://schemas.microsoft.com/office/drawing/2016/ink" xmlns:am3d="http://schemas.microsoft.com/office/drawing/2017/model3d" xmlns:o="urn:schemas-microsoft-com:office:office" xmlns:oel="http://schemas.microsoft.com/office/2019/extlst" xmlns:r="http://schemas.openxmlformats.org/officeDocument/2006/relationships" xmlns:m="http://schemas.openxmlformats.org/officeDocument/2006/math" xmlns:v="urn:schemas-microsoft-com:vml" xmlns:wp14="http://schemas.microsoft.com/office/word/2010/wordprocessingDrawing" xmlns:wp="http://schemas.openxmlformats.org/drawingml/2006/wordprocessingDrawing" xmlns:w10="urn:schemas-microsoft-com:office:word" xmlns:w="http://schemas.openxmlformats.org/wordprocessingml/2006/main" xmlns:w14="http://schemas.microsoft.com/office/word/2010/wordml" xmlns:w15="http://schemas.microsoft.com/office/word/2012/wordml" xmlns:w16cex="http://schemas.microsoft.com/office/word/2018/wordml/cex" xmlns:w16cid="http://schemas.microsoft.com/office/word/2016/wordml/cid" xmlns:w16="http://schemas.microsoft.com/office/word/2018/wordml" xmlns:w16du="http://schemas.microsoft.com/office/word/2023/wordml/word16du" xmlns:w16sdtdh="http://schemas.microsoft.com/office/word/2020/wordml/sdtdatahash" xmlns:w16sdtfl="http://schemas.microsoft.com/office/word/2024/wordml/sdtformatlock" xmlns:w16se="http://schemas.microsoft.com/office/word/2015/wordml/symex" xmlns:wpg="http://schemas.microsoft.com/office/word/2010/wordprocessingGroup" xmlns:wpi="http://schemas.microsoft.com/office/word/2010/wordprocessingInk" xmlns:wne="http://schemas.microsoft.com/office/word/2006/wordml" xmlns:wps="http://schemas.microsoft.com/office/word/2010/wordprocessingShape" mc:Ignorable="w14 w15 w16se w16cid w16 w16cex w16sdtdh w16sdtfl w16du wp14">
   <w:endnote w:type="separator" w:id="-1">
     <w:p>
       <w:r>
@@ -5551,7 +5511,7 @@
 </file>
 
 <file path=word/footer1.xml><?xml version="1.0" encoding="utf-8"?>
-<w:ftr xmlns:wpc="http://schemas.microsoft.com/office/word/2010/wordprocessingCanvas" xmlns:cx="http://schemas.microsoft.com/office/drawing/2014/chartex" xmlns:cx1="http://schemas.microsoft.com/office/drawing/2015/9/8/chartex" xmlns:cx2="http://schemas.microsoft.com/office/drawing/2015/10/21/chartex" xmlns:cx3="http://schemas.microsoft.com/office/drawing/2016/5/9/chartex" xmlns:cx4="http://schemas.microsoft.com/office/drawing/2016/5/10/chartex" xmlns:cx5="http://schemas.microsoft.com/office/drawing/2016/5/11/chartex" xmlns:cx6="http://schemas.microsoft.com/office/drawing/2016/5/12/chartex" xmlns:cx7="http://schemas.microsoft.com/office/drawing/2016/5/13/chartex" xmlns:cx8="http://schemas.microsoft.com/office/drawing/2016/5/14/chartex" xmlns:mc="http://schemas.openxmlformats.org/markup-compatibility/2006" xmlns:aink="http://schemas.microsoft.com/office/drawing/2016/ink" xmlns:am3d="http://schemas.microsoft.com/office/drawing/2017/model3d" xmlns:o="urn:schemas-microsoft-com:office:office" xmlns:oel="http://schemas.microsoft.com/office/2019/extlst" xmlns:r="http://schemas.openxmlformats.org/officeDocument/2006/relationships" xmlns:m="http://schemas.openxmlformats.org/officeDocument/2006/math" xmlns:v="urn:schemas-microsoft-com:vml" xmlns:wp14="http://schemas.microsoft.com/office/word/2010/wordprocessingDrawing" xmlns:wp="http://schemas.openxmlformats.org/drawingml/2006/wordprocessingDrawing" xmlns:w10="urn:schemas-microsoft-com:office:word" xmlns:w="http://schemas.openxmlformats.org/wordprocessingml/2006/main" xmlns:w14="http://schemas.microsoft.com/office/word/2010/wordml" xmlns:w15="http://schemas.microsoft.com/office/word/2012/wordml" xmlns:w16cex="http://schemas.microsoft.com/office/word/2018/wordml/cex" xmlns:w16cid="http://schemas.microsoft.com/office/word/2016/wordml/cid" xmlns:w16="http://schemas.microsoft.com/office/word/2018/wordml" xmlns:w16du="http://schemas.microsoft.com/office/word/2023/wordml/word16du" xmlns:w16sdtdh="http://schemas.microsoft.com/office/word/2020/wordml/sdtdatahash" xmlns:w16se="http://schemas.microsoft.com/office/word/2015/wordml/symex" xmlns:wpg="http://schemas.microsoft.com/office/word/2010/wordprocessingGroup" xmlns:wpi="http://schemas.microsoft.com/office/word/2010/wordprocessingInk" xmlns:wne="http://schemas.microsoft.com/office/word/2006/wordml" xmlns:wps="http://schemas.microsoft.com/office/word/2010/wordprocessingShape" mc:Ignorable="w14 w15 w16se w16cid w16 w16cex w16sdtdh w16du wp14">
+<w:ftr xmlns:wpc="http://schemas.microsoft.com/office/word/2010/wordprocessingCanvas" xmlns:cx="http://schemas.microsoft.com/office/drawing/2014/chartex" xmlns:cx1="http://schemas.microsoft.com/office/drawing/2015/9/8/chartex" xmlns:cx2="http://schemas.microsoft.com/office/drawing/2015/10/21/chartex" xmlns:cx3="http://schemas.microsoft.com/office/drawing/2016/5/9/chartex" xmlns:cx4="http://schemas.microsoft.com/office/drawing/2016/5/10/chartex" xmlns:cx5="http://schemas.microsoft.com/office/drawing/2016/5/11/chartex" xmlns:cx6="http://schemas.microsoft.com/office/drawing/2016/5/12/chartex" xmlns:cx7="http://schemas.microsoft.com/office/drawing/2016/5/13/chartex" xmlns:cx8="http://schemas.microsoft.com/office/drawing/2016/5/14/chartex" xmlns:mc="http://schemas.openxmlformats.org/markup-compatibility/2006" xmlns:aink="http://schemas.microsoft.com/office/drawing/2016/ink" xmlns:am3d="http://schemas.microsoft.com/office/drawing/2017/model3d" xmlns:o="urn:schemas-microsoft-com:office:office" xmlns:oel="http://schemas.microsoft.com/office/2019/extlst" xmlns:r="http://schemas.openxmlformats.org/officeDocument/2006/relationships" xmlns:m="http://schemas.openxmlformats.org/officeDocument/2006/math" xmlns:v="urn:schemas-microsoft-com:vml" xmlns:wp14="http://schemas.microsoft.com/office/word/2010/wordprocessingDrawing" xmlns:wp="http://schemas.openxmlformats.org/drawingml/2006/wordprocessingDrawing" xmlns:w10="urn:schemas-microsoft-com:office:word" xmlns:w="http://schemas.openxmlformats.org/wordprocessingml/2006/main" xmlns:w14="http://schemas.microsoft.com/office/word/2010/wordml" xmlns:w15="http://schemas.microsoft.com/office/word/2012/wordml" xmlns:w16cex="http://schemas.microsoft.com/office/word/2018/wordml/cex" xmlns:w16cid="http://schemas.microsoft.com/office/word/2016/wordml/cid" xmlns:w16="http://schemas.microsoft.com/office/word/2018/wordml" xmlns:w16du="http://schemas.microsoft.com/office/word/2023/wordml/word16du" xmlns:w16sdtdh="http://schemas.microsoft.com/office/word/2020/wordml/sdtdatahash" xmlns:w16sdtfl="http://schemas.microsoft.com/office/word/2024/wordml/sdtformatlock" xmlns:w16se="http://schemas.microsoft.com/office/word/2015/wordml/symex" xmlns:wpg="http://schemas.microsoft.com/office/word/2010/wordprocessingGroup" xmlns:wpi="http://schemas.microsoft.com/office/word/2010/wordprocessingInk" xmlns:wne="http://schemas.microsoft.com/office/word/2006/wordml" xmlns:wps="http://schemas.microsoft.com/office/word/2010/wordprocessingShape" mc:Ignorable="w14 w15 w16se w16cid w16 w16cex w16sdtdh w16sdtfl w16du wp14">
   <w:p>
     <w:pPr>
       <w:tabs>
@@ -5721,7 +5681,7 @@
 </file>
 
 <file path=word/footer2.xml><?xml version="1.0" encoding="utf-8"?>
-<w:ftr xmlns:wpc="http://schemas.microsoft.com/office/word/2010/wordprocessingCanvas" xmlns:cx="http://schemas.microsoft.com/office/drawing/2014/chartex" xmlns:cx1="http://schemas.microsoft.com/office/drawing/2015/9/8/chartex" xmlns:cx2="http://schemas.microsoft.com/office/drawing/2015/10/21/chartex" xmlns:cx3="http://schemas.microsoft.com/office/drawing/2016/5/9/chartex" xmlns:cx4="http://schemas.microsoft.com/office/drawing/2016/5/10/chartex" xmlns:cx5="http://schemas.microsoft.com/office/drawing/2016/5/11/chartex" xmlns:cx6="http://schemas.microsoft.com/office/drawing/2016/5/12/chartex" xmlns:cx7="http://schemas.microsoft.com/office/drawing/2016/5/13/chartex" xmlns:cx8="http://schemas.microsoft.com/office/drawing/2016/5/14/chartex" xmlns:mc="http://schemas.openxmlformats.org/markup-compatibility/2006" xmlns:aink="http://schemas.microsoft.com/office/drawing/2016/ink" xmlns:am3d="http://schemas.microsoft.com/office/drawing/2017/model3d" xmlns:o="urn:schemas-microsoft-com:office:office" xmlns:oel="http://schemas.microsoft.com/office/2019/extlst" xmlns:r="http://schemas.openxmlformats.org/officeDocument/2006/relationships" xmlns:m="http://schemas.openxmlformats.org/officeDocument/2006/math" xmlns:v="urn:schemas-microsoft-com:vml" xmlns:wp14="http://schemas.microsoft.com/office/word/2010/wordprocessingDrawing" xmlns:wp="http://schemas.openxmlformats.org/drawingml/2006/wordprocessingDrawing" xmlns:w10="urn:schemas-microsoft-com:office:word" xmlns:w="http://schemas.openxmlformats.org/wordprocessingml/2006/main" xmlns:w14="http://schemas.microsoft.com/office/word/2010/wordml" xmlns:w15="http://schemas.microsoft.com/office/word/2012/wordml" xmlns:w16cex="http://schemas.microsoft.com/office/word/2018/wordml/cex" xmlns:w16cid="http://schemas.microsoft.com/office/word/2016/wordml/cid" xmlns:w16="http://schemas.microsoft.com/office/word/2018/wordml" xmlns:w16du="http://schemas.microsoft.com/office/word/2023/wordml/word16du" xmlns:w16sdtdh="http://schemas.microsoft.com/office/word/2020/wordml/sdtdatahash" xmlns:w16se="http://schemas.microsoft.com/office/word/2015/wordml/symex" xmlns:wpg="http://schemas.microsoft.com/office/word/2010/wordprocessingGroup" xmlns:wpi="http://schemas.microsoft.com/office/word/2010/wordprocessingInk" xmlns:wne="http://schemas.microsoft.com/office/word/2006/wordml" xmlns:wps="http://schemas.microsoft.com/office/word/2010/wordprocessingShape" mc:Ignorable="w14 w15 w16se w16cid w16 w16cex w16sdtdh w16du wp14">
+<w:ftr xmlns:wpc="http://schemas.microsoft.com/office/word/2010/wordprocessingCanvas" xmlns:cx="http://schemas.microsoft.com/office/drawing/2014/chartex" xmlns:cx1="http://schemas.microsoft.com/office/drawing/2015/9/8/chartex" xmlns:cx2="http://schemas.microsoft.com/office/drawing/2015/10/21/chartex" xmlns:cx3="http://schemas.microsoft.com/office/drawing/2016/5/9/chartex" xmlns:cx4="http://schemas.microsoft.com/office/drawing/2016/5/10/chartex" xmlns:cx5="http://schemas.microsoft.com/office/drawing/2016/5/11/chartex" xmlns:cx6="http://schemas.microsoft.com/office/drawing/2016/5/12/chartex" xmlns:cx7="http://schemas.microsoft.com/office/drawing/2016/5/13/chartex" xmlns:cx8="http://schemas.microsoft.com/office/drawing/2016/5/14/chartex" xmlns:mc="http://schemas.openxmlformats.org/markup-compatibility/2006" xmlns:aink="http://schemas.microsoft.com/office/drawing/2016/ink" xmlns:am3d="http://schemas.microsoft.com/office/drawing/2017/model3d" xmlns:o="urn:schemas-microsoft-com:office:office" xmlns:oel="http://schemas.microsoft.com/office/2019/extlst" xmlns:r="http://schemas.openxmlformats.org/officeDocument/2006/relationships" xmlns:m="http://schemas.openxmlformats.org/officeDocument/2006/math" xmlns:v="urn:schemas-microsoft-com:vml" xmlns:wp14="http://schemas.microsoft.com/office/word/2010/wordprocessingDrawing" xmlns:wp="http://schemas.openxmlformats.org/drawingml/2006/wordprocessingDrawing" xmlns:w10="urn:schemas-microsoft-com:office:word" xmlns:w="http://schemas.openxmlformats.org/wordprocessingml/2006/main" xmlns:w14="http://schemas.microsoft.com/office/word/2010/wordml" xmlns:w15="http://schemas.microsoft.com/office/word/2012/wordml" xmlns:w16cex="http://schemas.microsoft.com/office/word/2018/wordml/cex" xmlns:w16cid="http://schemas.microsoft.com/office/word/2016/wordml/cid" xmlns:w16="http://schemas.microsoft.com/office/word/2018/wordml" xmlns:w16du="http://schemas.microsoft.com/office/word/2023/wordml/word16du" xmlns:w16sdtdh="http://schemas.microsoft.com/office/word/2020/wordml/sdtdatahash" xmlns:w16sdtfl="http://schemas.microsoft.com/office/word/2024/wordml/sdtformatlock" xmlns:w16se="http://schemas.microsoft.com/office/word/2015/wordml/symex" xmlns:wpg="http://schemas.microsoft.com/office/word/2010/wordprocessingGroup" xmlns:wpi="http://schemas.microsoft.com/office/word/2010/wordprocessingInk" xmlns:wne="http://schemas.microsoft.com/office/word/2006/wordml" xmlns:wps="http://schemas.microsoft.com/office/word/2010/wordprocessingShape" mc:Ignorable="w14 w15 w16se w16cid w16 w16cex w16sdtdh w16sdtfl w16du wp14">
   <w:p>
     <w:pPr>
       <w:pStyle w:val="Footer"/>
@@ -5866,31 +5826,70 @@
 </file>
 
 <file path=word/footer3.xml><?xml version="1.0" encoding="utf-8"?>
-<w:ftr xmlns:wpc="http://schemas.microsoft.com/office/word/2010/wordprocessingCanvas" xmlns:cx="http://schemas.microsoft.com/office/drawing/2014/chartex" xmlns:cx1="http://schemas.microsoft.com/office/drawing/2015/9/8/chartex" xmlns:cx2="http://schemas.microsoft.com/office/drawing/2015/10/21/chartex" xmlns:cx3="http://schemas.microsoft.com/office/drawing/2016/5/9/chartex" xmlns:cx4="http://schemas.microsoft.com/office/drawing/2016/5/10/chartex" xmlns:cx5="http://schemas.microsoft.com/office/drawing/2016/5/11/chartex" xmlns:cx6="http://schemas.microsoft.com/office/drawing/2016/5/12/chartex" xmlns:cx7="http://schemas.microsoft.com/office/drawing/2016/5/13/chartex" xmlns:cx8="http://schemas.microsoft.com/office/drawing/2016/5/14/chartex" xmlns:mc="http://schemas.openxmlformats.org/markup-compatibility/2006" xmlns:aink="http://schemas.microsoft.com/office/drawing/2016/ink" xmlns:am3d="http://schemas.microsoft.com/office/drawing/2017/model3d" xmlns:o="urn:schemas-microsoft-com:office:office" xmlns:oel="http://schemas.microsoft.com/office/2019/extlst" xmlns:r="http://schemas.openxmlformats.org/officeDocument/2006/relationships" xmlns:m="http://schemas.openxmlformats.org/officeDocument/2006/math" xmlns:v="urn:schemas-microsoft-com:vml" xmlns:wp14="http://schemas.microsoft.com/office/word/2010/wordprocessingDrawing" xmlns:wp="http://schemas.openxmlformats.org/drawingml/2006/wordprocessingDrawing" xmlns:w10="urn:schemas-microsoft-com:office:word" xmlns:w="http://schemas.openxmlformats.org/wordprocessingml/2006/main" xmlns:w14="http://schemas.microsoft.com/office/word/2010/wordml" xmlns:w15="http://schemas.microsoft.com/office/word/2012/wordml" xmlns:w16cex="http://schemas.microsoft.com/office/word/2018/wordml/cex" xmlns:w16cid="http://schemas.microsoft.com/office/word/2016/wordml/cid" xmlns:w16="http://schemas.microsoft.com/office/word/2018/wordml" xmlns:w16du="http://schemas.microsoft.com/office/word/2023/wordml/word16du" xmlns:w16sdtdh="http://schemas.microsoft.com/office/word/2020/wordml/sdtdatahash" xmlns:w16se="http://schemas.microsoft.com/office/word/2015/wordml/symex" xmlns:wpg="http://schemas.microsoft.com/office/word/2010/wordprocessingGroup" xmlns:wpi="http://schemas.microsoft.com/office/word/2010/wordprocessingInk" xmlns:wne="http://schemas.microsoft.com/office/word/2006/wordml" xmlns:wps="http://schemas.microsoft.com/office/word/2010/wordprocessingShape" mc:Ignorable="w14 w15 w16se w16cid w16 w16cex w16sdtdh w16du wp14">
+<w:ftr xmlns:wpc="http://schemas.microsoft.com/office/word/2010/wordprocessingCanvas" xmlns:cx="http://schemas.microsoft.com/office/drawing/2014/chartex" xmlns:cx1="http://schemas.microsoft.com/office/drawing/2015/9/8/chartex" xmlns:cx2="http://schemas.microsoft.com/office/drawing/2015/10/21/chartex" xmlns:cx3="http://schemas.microsoft.com/office/drawing/2016/5/9/chartex" xmlns:cx4="http://schemas.microsoft.com/office/drawing/2016/5/10/chartex" xmlns:cx5="http://schemas.microsoft.com/office/drawing/2016/5/11/chartex" xmlns:cx6="http://schemas.microsoft.com/office/drawing/2016/5/12/chartex" xmlns:cx7="http://schemas.microsoft.com/office/drawing/2016/5/13/chartex" xmlns:cx8="http://schemas.microsoft.com/office/drawing/2016/5/14/chartex" xmlns:mc="http://schemas.openxmlformats.org/markup-compatibility/2006" xmlns:aink="http://schemas.microsoft.com/office/drawing/2016/ink" xmlns:am3d="http://schemas.microsoft.com/office/drawing/2017/model3d" xmlns:o="urn:schemas-microsoft-com:office:office" xmlns:oel="http://schemas.microsoft.com/office/2019/extlst" xmlns:r="http://schemas.openxmlformats.org/officeDocument/2006/relationships" xmlns:m="http://schemas.openxmlformats.org/officeDocument/2006/math" xmlns:v="urn:schemas-microsoft-com:vml" xmlns:wp14="http://schemas.microsoft.com/office/word/2010/wordprocessingDrawing" xmlns:wp="http://schemas.openxmlformats.org/drawingml/2006/wordprocessingDrawing" xmlns:w10="urn:schemas-microsoft-com:office:word" xmlns:w="http://schemas.openxmlformats.org/wordprocessingml/2006/main" xmlns:w14="http://schemas.microsoft.com/office/word/2010/wordml" xmlns:w15="http://schemas.microsoft.com/office/word/2012/wordml" xmlns:w16cex="http://schemas.microsoft.com/office/word/2018/wordml/cex" xmlns:w16cid="http://schemas.microsoft.com/office/word/2016/wordml/cid" xmlns:w16="http://schemas.microsoft.com/office/word/2018/wordml" xmlns:w16du="http://schemas.microsoft.com/office/word/2023/wordml/word16du" xmlns:w16sdtdh="http://schemas.microsoft.com/office/word/2020/wordml/sdtdatahash" xmlns:w16sdtfl="http://schemas.microsoft.com/office/word/2024/wordml/sdtformatlock" xmlns:w16se="http://schemas.microsoft.com/office/word/2015/wordml/symex" xmlns:wpg="http://schemas.microsoft.com/office/word/2010/wordprocessingGroup" xmlns:wpi="http://schemas.microsoft.com/office/word/2010/wordprocessingInk" xmlns:wne="http://schemas.microsoft.com/office/word/2006/wordml" xmlns:wps="http://schemas.microsoft.com/office/word/2010/wordprocessingShape" mc:Ignorable="w14 w15 w16se w16cid w16 w16cex w16sdtdh w16sdtfl w16du wp14">
   <w:tbl>
     <w:tblPr>
+      <w:tblStyle w:val="21"/>
       <w:tblW w:w="0" w:type="auto"/>
-      <w:jc w:val="center"/>
-      <w:tblCellMar>
-        <w:left w:w="99" w:type="dxa"/>
-        <w:right w:w="99" w:type="dxa"/>
-      </w:tblCellMar>
       <w:tblLook w:val="0000" w:firstRow="0" w:lastRow="0" w:firstColumn="0" w:lastColumn="0" w:noHBand="0" w:noVBand="0"/>
     </w:tblPr>
     <w:tblGrid>
-      <w:gridCol w:w="6951"/>
+      <w:gridCol w:w="5215"/>
+      <w:gridCol w:w="1726"/>
     </w:tblGrid>
     <w:tr>
       <w:trPr>
-        <w:jc w:val="center"/>
+        <w:cnfStyle w:val="000000100000" w:firstRow="0" w:lastRow="0" w:firstColumn="0" w:lastColumn="0" w:oddVBand="0" w:evenVBand="0" w:oddHBand="1" w:evenHBand="0" w:firstRowFirstColumn="0" w:firstRowLastColumn="0" w:lastRowFirstColumn="0" w:lastRowLastColumn="0"/>
       </w:trPr>
       <w:tc>
         <w:tcPr>
-          <w:tcW w:w="8158" w:type="dxa"/>
+          <w:cnfStyle w:val="000010000000" w:firstRow="0" w:lastRow="0" w:firstColumn="0" w:lastColumn="0" w:oddVBand="1" w:evenVBand="0" w:oddHBand="0" w:evenHBand="0" w:firstRowFirstColumn="0" w:firstRowLastColumn="0" w:lastRowFirstColumn="0" w:lastRowLastColumn="0"/>
+          <w:tcW w:w="6941" w:type="dxa"/>
+          <w:gridSpan w:val="2"/>
         </w:tcPr>
         <w:p>
           <w:pPr>
             <w:pStyle w:val="Abstract"/>
+            <w:tabs>
+              <w:tab w:val="center" w:pos="3362"/>
+              <w:tab w:val="left" w:pos="4830"/>
+            </w:tabs>
+            <w:jc w:val="left"/>
+          </w:pPr>
+          <w:r>
+            <w:tab/>
+          </w:r>
+        </w:p>
+      </w:tc>
+    </w:tr>
+    <w:tr>
+      <w:tc>
+        <w:tcPr>
+          <w:cnfStyle w:val="000010000000" w:firstRow="0" w:lastRow="0" w:firstColumn="0" w:lastColumn="0" w:oddVBand="1" w:evenVBand="0" w:oddHBand="0" w:evenHBand="0" w:firstRowFirstColumn="0" w:firstRowLastColumn="0" w:lastRowFirstColumn="0" w:lastRowLastColumn="0"/>
+          <w:tcW w:w="6941" w:type="dxa"/>
+          <w:gridSpan w:val="2"/>
+        </w:tcPr>
+        <w:p>
+          <w:pPr>
+            <w:pStyle w:val="Abstract"/>
+          </w:pPr>
+        </w:p>
+      </w:tc>
+    </w:tr>
+    <w:tr>
+      <w:trPr>
+        <w:cnfStyle w:val="000000100000" w:firstRow="0" w:lastRow="0" w:firstColumn="0" w:lastColumn="0" w:oddVBand="0" w:evenVBand="0" w:oddHBand="1" w:evenHBand="0" w:firstRowFirstColumn="0" w:firstRowLastColumn="0" w:lastRowFirstColumn="0" w:lastRowLastColumn="0"/>
+      </w:trPr>
+      <w:tc>
+        <w:tcPr>
+          <w:cnfStyle w:val="000010000000" w:firstRow="0" w:lastRow="0" w:firstColumn="0" w:lastColumn="0" w:oddVBand="1" w:evenVBand="0" w:oddHBand="0" w:evenHBand="0" w:firstRowFirstColumn="0" w:firstRowLastColumn="0" w:lastRowFirstColumn="0" w:lastRowLastColumn="0"/>
+          <w:tcW w:w="6941" w:type="dxa"/>
+          <w:gridSpan w:val="2"/>
+        </w:tcPr>
+        <w:p>
+          <w:pPr>
+            <w:pStyle w:val="Abstract"/>
+            <w:jc w:val="right"/>
           </w:pPr>
           <w:r>
             <w:fldChar w:fldCharType="begin"/>
@@ -5898,21 +5897,11 @@
           <w:r>
             <w:instrText xml:space="preserve">if </w:instrText>
           </w:r>
-          <w:r>
-            <w:fldChar w:fldCharType="begin"/>
-          </w:r>
-          <w:r>
-            <w:instrText xml:space="preserve"> section </w:instrText>
-          </w:r>
-          <w:r>
-            <w:fldChar w:fldCharType="separate"/>
-          </w:r>
-          <w:r>
-            <w:instrText>2</w:instrText>
-          </w:r>
-          <w:r>
-            <w:fldChar w:fldCharType="end"/>
-          </w:r>
+          <w:fldSimple w:instr=" section ">
+            <w:r>
+              <w:instrText>2</w:instrText>
+            </w:r>
+          </w:fldSimple>
           <w:r>
             <w:instrText xml:space="preserve">="1" </w:instrText>
           </w:r>
@@ -5931,12 +5920,10 @@
       </w:tc>
     </w:tr>
     <w:tr>
-      <w:trPr>
-        <w:jc w:val="center"/>
-      </w:trPr>
       <w:tc>
         <w:tcPr>
-          <w:tcW w:w="8158" w:type="dxa"/>
+          <w:cnfStyle w:val="000010000000" w:firstRow="0" w:lastRow="0" w:firstColumn="0" w:lastColumn="0" w:oddVBand="1" w:evenVBand="0" w:oddHBand="0" w:evenHBand="0" w:firstRowFirstColumn="0" w:firstRowLastColumn="0" w:lastRowFirstColumn="0" w:lastRowLastColumn="0"/>
+          <w:tcW w:w="5215" w:type="dxa"/>
         </w:tcPr>
         <w:p>
           <w:pPr>
@@ -5948,21 +5935,11 @@
           <w:r>
             <w:instrText xml:space="preserve"> if </w:instrText>
           </w:r>
-          <w:r>
-            <w:fldChar w:fldCharType="begin"/>
-          </w:r>
-          <w:r>
-            <w:instrText xml:space="preserve"> section </w:instrText>
-          </w:r>
-          <w:r>
-            <w:fldChar w:fldCharType="separate"/>
-          </w:r>
-          <w:r>
-            <w:instrText>2</w:instrText>
-          </w:r>
-          <w:r>
-            <w:fldChar w:fldCharType="end"/>
-          </w:r>
+          <w:fldSimple w:instr=" section ">
+            <w:r>
+              <w:instrText>2</w:instrText>
+            </w:r>
+          </w:fldSimple>
           <w:r>
             <w:instrText>="1" "</w:instrText>
           </w:r>
@@ -5987,29 +5964,10 @@
           </w:r>
         </w:p>
       </w:tc>
-    </w:tr>
-    <w:tr>
-      <w:trPr>
-        <w:jc w:val="center"/>
-      </w:trPr>
       <w:tc>
         <w:tcPr>
-          <w:tcW w:w="8158" w:type="dxa"/>
-        </w:tcPr>
-        <w:p>
-          <w:pPr>
-            <w:pStyle w:val="Title"/>
-          </w:pPr>
-        </w:p>
-      </w:tc>
-    </w:tr>
-    <w:tr>
-      <w:trPr>
-        <w:jc w:val="center"/>
-      </w:trPr>
-      <w:tc>
-        <w:tcPr>
-          <w:tcW w:w="8158" w:type="dxa"/>
+          <w:cnfStyle w:val="000001000000" w:firstRow="0" w:lastRow="0" w:firstColumn="0" w:lastColumn="0" w:oddVBand="0" w:evenVBand="1" w:oddHBand="0" w:evenHBand="0" w:firstRowFirstColumn="0" w:firstRowLastColumn="0" w:lastRowFirstColumn="0" w:lastRowLastColumn="0"/>
+          <w:tcW w:w="1726" w:type="dxa"/>
         </w:tcPr>
         <w:p>
           <w:pPr>
@@ -6021,21 +5979,11 @@
           <w:r>
             <w:instrText xml:space="preserve"> if </w:instrText>
           </w:r>
-          <w:r>
-            <w:fldChar w:fldCharType="begin"/>
-          </w:r>
-          <w:r>
-            <w:instrText xml:space="preserve"> section </w:instrText>
-          </w:r>
-          <w:r>
-            <w:fldChar w:fldCharType="separate"/>
-          </w:r>
-          <w:r>
-            <w:instrText>2</w:instrText>
-          </w:r>
-          <w:r>
-            <w:fldChar w:fldCharType="end"/>
-          </w:r>
+          <w:fldSimple w:instr=" section ">
+            <w:r>
+              <w:instrText>2</w:instrText>
+            </w:r>
+          </w:fldSimple>
           <w:r>
             <w:instrText xml:space="preserve">="1" </w:instrText>
           </w:r>
@@ -6066,7 +6014,7 @@
 </file>
 
 <file path=word/footer4.xml><?xml version="1.0" encoding="utf-8"?>
-<w:ftr xmlns:wpc="http://schemas.microsoft.com/office/word/2010/wordprocessingCanvas" xmlns:cx="http://schemas.microsoft.com/office/drawing/2014/chartex" xmlns:cx1="http://schemas.microsoft.com/office/drawing/2015/9/8/chartex" xmlns:cx2="http://schemas.microsoft.com/office/drawing/2015/10/21/chartex" xmlns:cx3="http://schemas.microsoft.com/office/drawing/2016/5/9/chartex" xmlns:cx4="http://schemas.microsoft.com/office/drawing/2016/5/10/chartex" xmlns:cx5="http://schemas.microsoft.com/office/drawing/2016/5/11/chartex" xmlns:cx6="http://schemas.microsoft.com/office/drawing/2016/5/12/chartex" xmlns:cx7="http://schemas.microsoft.com/office/drawing/2016/5/13/chartex" xmlns:cx8="http://schemas.microsoft.com/office/drawing/2016/5/14/chartex" xmlns:mc="http://schemas.openxmlformats.org/markup-compatibility/2006" xmlns:aink="http://schemas.microsoft.com/office/drawing/2016/ink" xmlns:am3d="http://schemas.microsoft.com/office/drawing/2017/model3d" xmlns:o="urn:schemas-microsoft-com:office:office" xmlns:oel="http://schemas.microsoft.com/office/2019/extlst" xmlns:r="http://schemas.openxmlformats.org/officeDocument/2006/relationships" xmlns:m="http://schemas.openxmlformats.org/officeDocument/2006/math" xmlns:v="urn:schemas-microsoft-com:vml" xmlns:wp14="http://schemas.microsoft.com/office/word/2010/wordprocessingDrawing" xmlns:wp="http://schemas.openxmlformats.org/drawingml/2006/wordprocessingDrawing" xmlns:w10="urn:schemas-microsoft-com:office:word" xmlns:w="http://schemas.openxmlformats.org/wordprocessingml/2006/main" xmlns:w14="http://schemas.microsoft.com/office/word/2010/wordml" xmlns:w15="http://schemas.microsoft.com/office/word/2012/wordml" xmlns:w16cex="http://schemas.microsoft.com/office/word/2018/wordml/cex" xmlns:w16cid="http://schemas.microsoft.com/office/word/2016/wordml/cid" xmlns:w16="http://schemas.microsoft.com/office/word/2018/wordml" xmlns:w16du="http://schemas.microsoft.com/office/word/2023/wordml/word16du" xmlns:w16sdtdh="http://schemas.microsoft.com/office/word/2020/wordml/sdtdatahash" xmlns:w16se="http://schemas.microsoft.com/office/word/2015/wordml/symex" xmlns:wpg="http://schemas.microsoft.com/office/word/2010/wordprocessingGroup" xmlns:wpi="http://schemas.microsoft.com/office/word/2010/wordprocessingInk" xmlns:wne="http://schemas.microsoft.com/office/word/2006/wordml" xmlns:wps="http://schemas.microsoft.com/office/word/2010/wordprocessingShape" mc:Ignorable="w14 w15 w16se w16cid w16 w16cex w16sdtdh w16du wp14">
+<w:ftr xmlns:wpc="http://schemas.microsoft.com/office/word/2010/wordprocessingCanvas" xmlns:cx="http://schemas.microsoft.com/office/drawing/2014/chartex" xmlns:cx1="http://schemas.microsoft.com/office/drawing/2015/9/8/chartex" xmlns:cx2="http://schemas.microsoft.com/office/drawing/2015/10/21/chartex" xmlns:cx3="http://schemas.microsoft.com/office/drawing/2016/5/9/chartex" xmlns:cx4="http://schemas.microsoft.com/office/drawing/2016/5/10/chartex" xmlns:cx5="http://schemas.microsoft.com/office/drawing/2016/5/11/chartex" xmlns:cx6="http://schemas.microsoft.com/office/drawing/2016/5/12/chartex" xmlns:cx7="http://schemas.microsoft.com/office/drawing/2016/5/13/chartex" xmlns:cx8="http://schemas.microsoft.com/office/drawing/2016/5/14/chartex" xmlns:mc="http://schemas.openxmlformats.org/markup-compatibility/2006" xmlns:aink="http://schemas.microsoft.com/office/drawing/2016/ink" xmlns:am3d="http://schemas.microsoft.com/office/drawing/2017/model3d" xmlns:o="urn:schemas-microsoft-com:office:office" xmlns:oel="http://schemas.microsoft.com/office/2019/extlst" xmlns:r="http://schemas.openxmlformats.org/officeDocument/2006/relationships" xmlns:m="http://schemas.openxmlformats.org/officeDocument/2006/math" xmlns:v="urn:schemas-microsoft-com:vml" xmlns:wp14="http://schemas.microsoft.com/office/word/2010/wordprocessingDrawing" xmlns:wp="http://schemas.openxmlformats.org/drawingml/2006/wordprocessingDrawing" xmlns:w10="urn:schemas-microsoft-com:office:word" xmlns:w="http://schemas.openxmlformats.org/wordprocessingml/2006/main" xmlns:w14="http://schemas.microsoft.com/office/word/2010/wordml" xmlns:w15="http://schemas.microsoft.com/office/word/2012/wordml" xmlns:w16cex="http://schemas.microsoft.com/office/word/2018/wordml/cex" xmlns:w16cid="http://schemas.microsoft.com/office/word/2016/wordml/cid" xmlns:w16="http://schemas.microsoft.com/office/word/2018/wordml" xmlns:w16du="http://schemas.microsoft.com/office/word/2023/wordml/word16du" xmlns:w16sdtdh="http://schemas.microsoft.com/office/word/2020/wordml/sdtdatahash" xmlns:w16sdtfl="http://schemas.microsoft.com/office/word/2024/wordml/sdtformatlock" xmlns:w16se="http://schemas.microsoft.com/office/word/2015/wordml/symex" xmlns:wpg="http://schemas.microsoft.com/office/word/2010/wordprocessingGroup" xmlns:wpi="http://schemas.microsoft.com/office/word/2010/wordprocessingInk" xmlns:wne="http://schemas.microsoft.com/office/word/2006/wordml" xmlns:wps="http://schemas.microsoft.com/office/word/2010/wordprocessingShape" mc:Ignorable="w14 w15 w16se w16cid w16 w16cex w16sdtdh w16sdtfl w16du wp14">
   <w:p>
     <w:pPr>
       <w:pStyle w:val="Footer"/>
@@ -6079,7 +6027,7 @@
 </file>
 
 <file path=word/footnotes.xml><?xml version="1.0" encoding="utf-8"?>
-<w:footnotes xmlns:wpc="http://schemas.microsoft.com/office/word/2010/wordprocessingCanvas" xmlns:cx="http://schemas.microsoft.com/office/drawing/2014/chartex" xmlns:cx1="http://schemas.microsoft.com/office/drawing/2015/9/8/chartex" xmlns:cx2="http://schemas.microsoft.com/office/drawing/2015/10/21/chartex" xmlns:cx3="http://schemas.microsoft.com/office/drawing/2016/5/9/chartex" xmlns:cx4="http://schemas.microsoft.com/office/drawing/2016/5/10/chartex" xmlns:cx5="http://schemas.microsoft.com/office/drawing/2016/5/11/chartex" xmlns:cx6="http://schemas.microsoft.com/office/drawing/2016/5/12/chartex" xmlns:cx7="http://schemas.microsoft.com/office/drawing/2016/5/13/chartex" xmlns:cx8="http://schemas.microsoft.com/office/drawing/2016/5/14/chartex" xmlns:mc="http://schemas.openxmlformats.org/markup-compatibility/2006" xmlns:aink="http://schemas.microsoft.com/office/drawing/2016/ink" xmlns:am3d="http://schemas.microsoft.com/office/drawing/2017/model3d" xmlns:o="urn:schemas-microsoft-com:office:office" xmlns:oel="http://schemas.microsoft.com/office/2019/extlst" xmlns:r="http://schemas.openxmlformats.org/officeDocument/2006/relationships" xmlns:m="http://schemas.openxmlformats.org/officeDocument/2006/math" xmlns:v="urn:schemas-microsoft-com:vml" xmlns:wp14="http://schemas.microsoft.com/office/word/2010/wordprocessingDrawing" xmlns:wp="http://schemas.openxmlformats.org/drawingml/2006/wordprocessingDrawing" xmlns:w10="urn:schemas-microsoft-com:office:word" xmlns:w="http://schemas.openxmlformats.org/wordprocessingml/2006/main" xmlns:w14="http://schemas.microsoft.com/office/word/2010/wordml" xmlns:w15="http://schemas.microsoft.com/office/word/2012/wordml" xmlns:w16cex="http://schemas.microsoft.com/office/word/2018/wordml/cex" xmlns:w16cid="http://schemas.microsoft.com/office/word/2016/wordml/cid" xmlns:w16="http://schemas.microsoft.com/office/word/2018/wordml" xmlns:w16du="http://schemas.microsoft.com/office/word/2023/wordml/word16du" xmlns:w16sdtdh="http://schemas.microsoft.com/office/word/2020/wordml/sdtdatahash" xmlns:w16se="http://schemas.microsoft.com/office/word/2015/wordml/symex" xmlns:wpg="http://schemas.microsoft.com/office/word/2010/wordprocessingGroup" xmlns:wpi="http://schemas.microsoft.com/office/word/2010/wordprocessingInk" xmlns:wne="http://schemas.microsoft.com/office/word/2006/wordml" xmlns:wps="http://schemas.microsoft.com/office/word/2010/wordprocessingShape" mc:Ignorable="w14 w15 w16se w16cid w16 w16cex w16sdtdh w16du wp14">
+<w:footnotes xmlns:wpc="http://schemas.microsoft.com/office/word/2010/wordprocessingCanvas" xmlns:cx="http://schemas.microsoft.com/office/drawing/2014/chartex" xmlns:cx1="http://schemas.microsoft.com/office/drawing/2015/9/8/chartex" xmlns:cx2="http://schemas.microsoft.com/office/drawing/2015/10/21/chartex" xmlns:cx3="http://schemas.microsoft.com/office/drawing/2016/5/9/chartex" xmlns:cx4="http://schemas.microsoft.com/office/drawing/2016/5/10/chartex" xmlns:cx5="http://schemas.microsoft.com/office/drawing/2016/5/11/chartex" xmlns:cx6="http://schemas.microsoft.com/office/drawing/2016/5/12/chartex" xmlns:cx7="http://schemas.microsoft.com/office/drawing/2016/5/13/chartex" xmlns:cx8="http://schemas.microsoft.com/office/drawing/2016/5/14/chartex" xmlns:mc="http://schemas.openxmlformats.org/markup-compatibility/2006" xmlns:aink="http://schemas.microsoft.com/office/drawing/2016/ink" xmlns:am3d="http://schemas.microsoft.com/office/drawing/2017/model3d" xmlns:o="urn:schemas-microsoft-com:office:office" xmlns:oel="http://schemas.microsoft.com/office/2019/extlst" xmlns:r="http://schemas.openxmlformats.org/officeDocument/2006/relationships" xmlns:m="http://schemas.openxmlformats.org/officeDocument/2006/math" xmlns:v="urn:schemas-microsoft-com:vml" xmlns:wp14="http://schemas.microsoft.com/office/word/2010/wordprocessingDrawing" xmlns:wp="http://schemas.openxmlformats.org/drawingml/2006/wordprocessingDrawing" xmlns:w10="urn:schemas-microsoft-com:office:word" xmlns:w="http://schemas.openxmlformats.org/wordprocessingml/2006/main" xmlns:w14="http://schemas.microsoft.com/office/word/2010/wordml" xmlns:w15="http://schemas.microsoft.com/office/word/2012/wordml" xmlns:w16cex="http://schemas.microsoft.com/office/word/2018/wordml/cex" xmlns:w16cid="http://schemas.microsoft.com/office/word/2016/wordml/cid" xmlns:w16="http://schemas.microsoft.com/office/word/2018/wordml" xmlns:w16du="http://schemas.microsoft.com/office/word/2023/wordml/word16du" xmlns:w16sdtdh="http://schemas.microsoft.com/office/word/2020/wordml/sdtdatahash" xmlns:w16sdtfl="http://schemas.microsoft.com/office/word/2024/wordml/sdtformatlock" xmlns:w16se="http://schemas.microsoft.com/office/word/2015/wordml/symex" xmlns:wpg="http://schemas.microsoft.com/office/word/2010/wordprocessingGroup" xmlns:wpi="http://schemas.microsoft.com/office/word/2010/wordprocessingInk" xmlns:wne="http://schemas.microsoft.com/office/word/2006/wordml" xmlns:wps="http://schemas.microsoft.com/office/word/2010/wordprocessingShape" mc:Ignorable="w14 w15 w16se w16cid w16 w16cex w16sdtdh w16sdtfl w16du wp14">
   <w:footnote w:type="separator" w:id="-1">
     <w:p>
       <w:r>
@@ -6098,7 +6046,7 @@
 </file>
 
 <file path=word/header1.xml><?xml version="1.0" encoding="utf-8"?>
-<w:hdr xmlns:wpc="http://schemas.microsoft.com/office/word/2010/wordprocessingCanvas" xmlns:cx="http://schemas.microsoft.com/office/drawing/2014/chartex" xmlns:cx1="http://schemas.microsoft.com/office/drawing/2015/9/8/chartex" xmlns:cx2="http://schemas.microsoft.com/office/drawing/2015/10/21/chartex" xmlns:cx3="http://schemas.microsoft.com/office/drawing/2016/5/9/chartex" xmlns:cx4="http://schemas.microsoft.com/office/drawing/2016/5/10/chartex" xmlns:cx5="http://schemas.microsoft.com/office/drawing/2016/5/11/chartex" xmlns:cx6="http://schemas.microsoft.com/office/drawing/2016/5/12/chartex" xmlns:cx7="http://schemas.microsoft.com/office/drawing/2016/5/13/chartex" xmlns:cx8="http://schemas.microsoft.com/office/drawing/2016/5/14/chartex" xmlns:mc="http://schemas.openxmlformats.org/markup-compatibility/2006" xmlns:aink="http://schemas.microsoft.com/office/drawing/2016/ink" xmlns:am3d="http://schemas.microsoft.com/office/drawing/2017/model3d" xmlns:o="urn:schemas-microsoft-com:office:office" xmlns:oel="http://schemas.microsoft.com/office/2019/extlst" xmlns:r="http://schemas.openxmlformats.org/officeDocument/2006/relationships" xmlns:m="http://schemas.openxmlformats.org/officeDocument/2006/math" xmlns:v="urn:schemas-microsoft-com:vml" xmlns:wp14="http://schemas.microsoft.com/office/word/2010/wordprocessingDrawing" xmlns:wp="http://schemas.openxmlformats.org/drawingml/2006/wordprocessingDrawing" xmlns:w10="urn:schemas-microsoft-com:office:word" xmlns:w="http://schemas.openxmlformats.org/wordprocessingml/2006/main" xmlns:w14="http://schemas.microsoft.com/office/word/2010/wordml" xmlns:w15="http://schemas.microsoft.com/office/word/2012/wordml" xmlns:w16cex="http://schemas.microsoft.com/office/word/2018/wordml/cex" xmlns:w16cid="http://schemas.microsoft.com/office/word/2016/wordml/cid" xmlns:w16="http://schemas.microsoft.com/office/word/2018/wordml" xmlns:w16du="http://schemas.microsoft.com/office/word/2023/wordml/word16du" xmlns:w16sdtdh="http://schemas.microsoft.com/office/word/2020/wordml/sdtdatahash" xmlns:w16se="http://schemas.microsoft.com/office/word/2015/wordml/symex" xmlns:wpg="http://schemas.microsoft.com/office/word/2010/wordprocessingGroup" xmlns:wpi="http://schemas.microsoft.com/office/word/2010/wordprocessingInk" xmlns:wne="http://schemas.microsoft.com/office/word/2006/wordml" xmlns:wps="http://schemas.microsoft.com/office/word/2010/wordprocessingShape" mc:Ignorable="w14 w15 w16se w16cid w16 w16cex w16sdtdh w16du wp14">
+<w:hdr xmlns:wpc="http://schemas.microsoft.com/office/word/2010/wordprocessingCanvas" xmlns:cx="http://schemas.microsoft.com/office/drawing/2014/chartex" xmlns:cx1="http://schemas.microsoft.com/office/drawing/2015/9/8/chartex" xmlns:cx2="http://schemas.microsoft.com/office/drawing/2015/10/21/chartex" xmlns:cx3="http://schemas.microsoft.com/office/drawing/2016/5/9/chartex" xmlns:cx4="http://schemas.microsoft.com/office/drawing/2016/5/10/chartex" xmlns:cx5="http://schemas.microsoft.com/office/drawing/2016/5/11/chartex" xmlns:cx6="http://schemas.microsoft.com/office/drawing/2016/5/12/chartex" xmlns:cx7="http://schemas.microsoft.com/office/drawing/2016/5/13/chartex" xmlns:cx8="http://schemas.microsoft.com/office/drawing/2016/5/14/chartex" xmlns:mc="http://schemas.openxmlformats.org/markup-compatibility/2006" xmlns:aink="http://schemas.microsoft.com/office/drawing/2016/ink" xmlns:am3d="http://schemas.microsoft.com/office/drawing/2017/model3d" xmlns:o="urn:schemas-microsoft-com:office:office" xmlns:oel="http://schemas.microsoft.com/office/2019/extlst" xmlns:r="http://schemas.openxmlformats.org/officeDocument/2006/relationships" xmlns:m="http://schemas.openxmlformats.org/officeDocument/2006/math" xmlns:v="urn:schemas-microsoft-com:vml" xmlns:wp14="http://schemas.microsoft.com/office/word/2010/wordprocessingDrawing" xmlns:wp="http://schemas.openxmlformats.org/drawingml/2006/wordprocessingDrawing" xmlns:w10="urn:schemas-microsoft-com:office:word" xmlns:w="http://schemas.openxmlformats.org/wordprocessingml/2006/main" xmlns:w14="http://schemas.microsoft.com/office/word/2010/wordml" xmlns:w15="http://schemas.microsoft.com/office/word/2012/wordml" xmlns:w16cex="http://schemas.microsoft.com/office/word/2018/wordml/cex" xmlns:w16cid="http://schemas.microsoft.com/office/word/2016/wordml/cid" xmlns:w16="http://schemas.microsoft.com/office/word/2018/wordml" xmlns:w16du="http://schemas.microsoft.com/office/word/2023/wordml/word16du" xmlns:w16sdtdh="http://schemas.microsoft.com/office/word/2020/wordml/sdtdatahash" xmlns:w16sdtfl="http://schemas.microsoft.com/office/word/2024/wordml/sdtformatlock" xmlns:w16se="http://schemas.microsoft.com/office/word/2015/wordml/symex" xmlns:wpg="http://schemas.microsoft.com/office/word/2010/wordprocessingGroup" xmlns:wpi="http://schemas.microsoft.com/office/word/2010/wordprocessingInk" xmlns:wne="http://schemas.microsoft.com/office/word/2006/wordml" xmlns:wps="http://schemas.microsoft.com/office/word/2010/wordprocessingShape" mc:Ignorable="w14 w15 w16se w16cid w16 w16cex w16sdtdh w16sdtfl w16du wp14">
   <w:p>
     <w:pPr>
       <w:pStyle w:val="Header"/>
@@ -6153,7 +6101,7 @@
 </file>
 
 <file path=word/header2.xml><?xml version="1.0" encoding="utf-8"?>
-<w:hdr xmlns:wpc="http://schemas.microsoft.com/office/word/2010/wordprocessingCanvas" xmlns:cx="http://schemas.microsoft.com/office/drawing/2014/chartex" xmlns:cx1="http://schemas.microsoft.com/office/drawing/2015/9/8/chartex" xmlns:cx2="http://schemas.microsoft.com/office/drawing/2015/10/21/chartex" xmlns:cx3="http://schemas.microsoft.com/office/drawing/2016/5/9/chartex" xmlns:cx4="http://schemas.microsoft.com/office/drawing/2016/5/10/chartex" xmlns:cx5="http://schemas.microsoft.com/office/drawing/2016/5/11/chartex" xmlns:cx6="http://schemas.microsoft.com/office/drawing/2016/5/12/chartex" xmlns:cx7="http://schemas.microsoft.com/office/drawing/2016/5/13/chartex" xmlns:cx8="http://schemas.microsoft.com/office/drawing/2016/5/14/chartex" xmlns:mc="http://schemas.openxmlformats.org/markup-compatibility/2006" xmlns:aink="http://schemas.microsoft.com/office/drawing/2016/ink" xmlns:am3d="http://schemas.microsoft.com/office/drawing/2017/model3d" xmlns:o="urn:schemas-microsoft-com:office:office" xmlns:oel="http://schemas.microsoft.com/office/2019/extlst" xmlns:r="http://schemas.openxmlformats.org/officeDocument/2006/relationships" xmlns:m="http://schemas.openxmlformats.org/officeDocument/2006/math" xmlns:v="urn:schemas-microsoft-com:vml" xmlns:wp14="http://schemas.microsoft.com/office/word/2010/wordprocessingDrawing" xmlns:wp="http://schemas.openxmlformats.org/drawingml/2006/wordprocessingDrawing" xmlns:w10="urn:schemas-microsoft-com:office:word" xmlns:w="http://schemas.openxmlformats.org/wordprocessingml/2006/main" xmlns:w14="http://schemas.microsoft.com/office/word/2010/wordml" xmlns:w15="http://schemas.microsoft.com/office/word/2012/wordml" xmlns:w16cex="http://schemas.microsoft.com/office/word/2018/wordml/cex" xmlns:w16cid="http://schemas.microsoft.com/office/word/2016/wordml/cid" xmlns:w16="http://schemas.microsoft.com/office/word/2018/wordml" xmlns:w16du="http://schemas.microsoft.com/office/word/2023/wordml/word16du" xmlns:w16sdtdh="http://schemas.microsoft.com/office/word/2020/wordml/sdtdatahash" xmlns:w16se="http://schemas.microsoft.com/office/word/2015/wordml/symex" xmlns:wpg="http://schemas.microsoft.com/office/word/2010/wordprocessingGroup" xmlns:wpi="http://schemas.microsoft.com/office/word/2010/wordprocessingInk" xmlns:wne="http://schemas.microsoft.com/office/word/2006/wordml" xmlns:wps="http://schemas.microsoft.com/office/word/2010/wordprocessingShape" mc:Ignorable="w14 w15 w16se w16cid w16 w16cex w16sdtdh w16du wp14">
+<w:hdr xmlns:wpc="http://schemas.microsoft.com/office/word/2010/wordprocessingCanvas" xmlns:cx="http://schemas.microsoft.com/office/drawing/2014/chartex" xmlns:cx1="http://schemas.microsoft.com/office/drawing/2015/9/8/chartex" xmlns:cx2="http://schemas.microsoft.com/office/drawing/2015/10/21/chartex" xmlns:cx3="http://schemas.microsoft.com/office/drawing/2016/5/9/chartex" xmlns:cx4="http://schemas.microsoft.com/office/drawing/2016/5/10/chartex" xmlns:cx5="http://schemas.microsoft.com/office/drawing/2016/5/11/chartex" xmlns:cx6="http://schemas.microsoft.com/office/drawing/2016/5/12/chartex" xmlns:cx7="http://schemas.microsoft.com/office/drawing/2016/5/13/chartex" xmlns:cx8="http://schemas.microsoft.com/office/drawing/2016/5/14/chartex" xmlns:mc="http://schemas.openxmlformats.org/markup-compatibility/2006" xmlns:aink="http://schemas.microsoft.com/office/drawing/2016/ink" xmlns:am3d="http://schemas.microsoft.com/office/drawing/2017/model3d" xmlns:o="urn:schemas-microsoft-com:office:office" xmlns:oel="http://schemas.microsoft.com/office/2019/extlst" xmlns:r="http://schemas.openxmlformats.org/officeDocument/2006/relationships" xmlns:m="http://schemas.openxmlformats.org/officeDocument/2006/math" xmlns:v="urn:schemas-microsoft-com:vml" xmlns:wp14="http://schemas.microsoft.com/office/word/2010/wordprocessingDrawing" xmlns:wp="http://schemas.openxmlformats.org/drawingml/2006/wordprocessingDrawing" xmlns:w10="urn:schemas-microsoft-com:office:word" xmlns:w="http://schemas.openxmlformats.org/wordprocessingml/2006/main" xmlns:w14="http://schemas.microsoft.com/office/word/2010/wordml" xmlns:w15="http://schemas.microsoft.com/office/word/2012/wordml" xmlns:w16cex="http://schemas.microsoft.com/office/word/2018/wordml/cex" xmlns:w16cid="http://schemas.microsoft.com/office/word/2016/wordml/cid" xmlns:w16="http://schemas.microsoft.com/office/word/2018/wordml" xmlns:w16du="http://schemas.microsoft.com/office/word/2023/wordml/word16du" xmlns:w16sdtdh="http://schemas.microsoft.com/office/word/2020/wordml/sdtdatahash" xmlns:w16sdtfl="http://schemas.microsoft.com/office/word/2024/wordml/sdtformatlock" xmlns:w16se="http://schemas.microsoft.com/office/word/2015/wordml/symex" xmlns:wpg="http://schemas.microsoft.com/office/word/2010/wordprocessingGroup" xmlns:wpi="http://schemas.microsoft.com/office/word/2010/wordprocessingInk" xmlns:wne="http://schemas.microsoft.com/office/word/2006/wordml" xmlns:wps="http://schemas.microsoft.com/office/word/2010/wordprocessingShape" mc:Ignorable="w14 w15 w16se w16cid w16 w16cex w16sdtdh w16sdtfl w16du wp14">
   <w:p>
     <w:pPr>
       <w:pStyle w:val="Header"/>
@@ -6209,7 +6157,7 @@
 </file>
 
 <file path=word/numbering.xml><?xml version="1.0" encoding="utf-8"?>
-<w:numbering xmlns:wpc="http://schemas.microsoft.com/office/word/2010/wordprocessingCanvas" xmlns:cx="http://schemas.microsoft.com/office/drawing/2014/chartex" xmlns:cx1="http://schemas.microsoft.com/office/drawing/2015/9/8/chartex" xmlns:cx2="http://schemas.microsoft.com/office/drawing/2015/10/21/chartex" xmlns:cx3="http://schemas.microsoft.com/office/drawing/2016/5/9/chartex" xmlns:cx4="http://schemas.microsoft.com/office/drawing/2016/5/10/chartex" xmlns:cx5="http://schemas.microsoft.com/office/drawing/2016/5/11/chartex" xmlns:cx6="http://schemas.microsoft.com/office/drawing/2016/5/12/chartex" xmlns:cx7="http://schemas.microsoft.com/office/drawing/2016/5/13/chartex" xmlns:cx8="http://schemas.microsoft.com/office/drawing/2016/5/14/chartex" xmlns:mc="http://schemas.openxmlformats.org/markup-compatibility/2006" xmlns:aink="http://schemas.microsoft.com/office/drawing/2016/ink" xmlns:am3d="http://schemas.microsoft.com/office/drawing/2017/model3d" xmlns:o="urn:schemas-microsoft-com:office:office" xmlns:oel="http://schemas.microsoft.com/office/2019/extlst" xmlns:r="http://schemas.openxmlformats.org/officeDocument/2006/relationships" xmlns:m="http://schemas.openxmlformats.org/officeDocument/2006/math" xmlns:v="urn:schemas-microsoft-com:vml" xmlns:wp14="http://schemas.microsoft.com/office/word/2010/wordprocessingDrawing" xmlns:wp="http://schemas.openxmlformats.org/drawingml/2006/wordprocessingDrawing" xmlns:w10="urn:schemas-microsoft-com:office:word" xmlns:w="http://schemas.openxmlformats.org/wordprocessingml/2006/main" xmlns:w14="http://schemas.microsoft.com/office/word/2010/wordml" xmlns:w15="http://schemas.microsoft.com/office/word/2012/wordml" xmlns:w16cex="http://schemas.microsoft.com/office/word/2018/wordml/cex" xmlns:w16cid="http://schemas.microsoft.com/office/word/2016/wordml/cid" xmlns:w16="http://schemas.microsoft.com/office/word/2018/wordml" xmlns:w16du="http://schemas.microsoft.com/office/word/2023/wordml/word16du" xmlns:w16sdtdh="http://schemas.microsoft.com/office/word/2020/wordml/sdtdatahash" xmlns:w16se="http://schemas.microsoft.com/office/word/2015/wordml/symex" xmlns:wpg="http://schemas.microsoft.com/office/word/2010/wordprocessingGroup" xmlns:wpi="http://schemas.microsoft.com/office/word/2010/wordprocessingInk" xmlns:wne="http://schemas.microsoft.com/office/word/2006/wordml" xmlns:wps="http://schemas.microsoft.com/office/word/2010/wordprocessingShape" mc:Ignorable="w14 w15 w16se w16cid w16 w16cex w16sdtdh w16du wp14">
+<w:numbering xmlns:wpc="http://schemas.microsoft.com/office/word/2010/wordprocessingCanvas" xmlns:cx="http://schemas.microsoft.com/office/drawing/2014/chartex" xmlns:cx1="http://schemas.microsoft.com/office/drawing/2015/9/8/chartex" xmlns:cx2="http://schemas.microsoft.com/office/drawing/2015/10/21/chartex" xmlns:cx3="http://schemas.microsoft.com/office/drawing/2016/5/9/chartex" xmlns:cx4="http://schemas.microsoft.com/office/drawing/2016/5/10/chartex" xmlns:cx5="http://schemas.microsoft.com/office/drawing/2016/5/11/chartex" xmlns:cx6="http://schemas.microsoft.com/office/drawing/2016/5/12/chartex" xmlns:cx7="http://schemas.microsoft.com/office/drawing/2016/5/13/chartex" xmlns:cx8="http://schemas.microsoft.com/office/drawing/2016/5/14/chartex" xmlns:mc="http://schemas.openxmlformats.org/markup-compatibility/2006" xmlns:aink="http://schemas.microsoft.com/office/drawing/2016/ink" xmlns:am3d="http://schemas.microsoft.com/office/drawing/2017/model3d" xmlns:o="urn:schemas-microsoft-com:office:office" xmlns:oel="http://schemas.microsoft.com/office/2019/extlst" xmlns:r="http://schemas.openxmlformats.org/officeDocument/2006/relationships" xmlns:m="http://schemas.openxmlformats.org/officeDocument/2006/math" xmlns:v="urn:schemas-microsoft-com:vml" xmlns:wp14="http://schemas.microsoft.com/office/word/2010/wordprocessingDrawing" xmlns:wp="http://schemas.openxmlformats.org/drawingml/2006/wordprocessingDrawing" xmlns:w10="urn:schemas-microsoft-com:office:word" xmlns:w="http://schemas.openxmlformats.org/wordprocessingml/2006/main" xmlns:w14="http://schemas.microsoft.com/office/word/2010/wordml" xmlns:w15="http://schemas.microsoft.com/office/word/2012/wordml" xmlns:w16cex="http://schemas.microsoft.com/office/word/2018/wordml/cex" xmlns:w16cid="http://schemas.microsoft.com/office/word/2016/wordml/cid" xmlns:w16="http://schemas.microsoft.com/office/word/2018/wordml" xmlns:w16du="http://schemas.microsoft.com/office/word/2023/wordml/word16du" xmlns:w16sdtdh="http://schemas.microsoft.com/office/word/2020/wordml/sdtdatahash" xmlns:w16sdtfl="http://schemas.microsoft.com/office/word/2024/wordml/sdtformatlock" xmlns:w16se="http://schemas.microsoft.com/office/word/2015/wordml/symex" xmlns:wpg="http://schemas.microsoft.com/office/word/2010/wordprocessingGroup" xmlns:wpi="http://schemas.microsoft.com/office/word/2010/wordprocessingInk" xmlns:wne="http://schemas.microsoft.com/office/word/2006/wordml" xmlns:wps="http://schemas.microsoft.com/office/word/2010/wordprocessingShape" mc:Ignorable="w14 w15 w16se w16cid w16 w16cex w16sdtdh w16sdtfl w16du wp14">
   <w:abstractNum w:abstractNumId="0" w15:restartNumberingAfterBreak="0">
     <w:nsid w:val="FFFFFF7C"/>
     <w:multiLevelType w:val="singleLevel"/>
@@ -12654,7 +12602,7 @@
 </file>
 
 <file path=word/styles.xml><?xml version="1.0" encoding="utf-8"?>
-<w:styles xmlns:mc="http://schemas.openxmlformats.org/markup-compatibility/2006" xmlns:r="http://schemas.openxmlformats.org/officeDocument/2006/relationships" xmlns:w="http://schemas.openxmlformats.org/wordprocessingml/2006/main" xmlns:w14="http://schemas.microsoft.com/office/word/2010/wordml" xmlns:w15="http://schemas.microsoft.com/office/word/2012/wordml" xmlns:w16cex="http://schemas.microsoft.com/office/word/2018/wordml/cex" xmlns:w16cid="http://schemas.microsoft.com/office/word/2016/wordml/cid" xmlns:w16="http://schemas.microsoft.com/office/word/2018/wordml" xmlns:w16du="http://schemas.microsoft.com/office/word/2023/wordml/word16du" xmlns:w16sdtdh="http://schemas.microsoft.com/office/word/2020/wordml/sdtdatahash" xmlns:w16se="http://schemas.microsoft.com/office/word/2015/wordml/symex" mc:Ignorable="w14 w15 w16se w16cid w16 w16cex w16sdtdh w16du">
+<w:styles xmlns:mc="http://schemas.openxmlformats.org/markup-compatibility/2006" xmlns:r="http://schemas.openxmlformats.org/officeDocument/2006/relationships" xmlns:w="http://schemas.openxmlformats.org/wordprocessingml/2006/main" xmlns:w14="http://schemas.microsoft.com/office/word/2010/wordml" xmlns:w15="http://schemas.microsoft.com/office/word/2012/wordml" xmlns:w16cex="http://schemas.microsoft.com/office/word/2018/wordml/cex" xmlns:w16cid="http://schemas.microsoft.com/office/word/2016/wordml/cid" xmlns:w16="http://schemas.microsoft.com/office/word/2018/wordml" xmlns:w16du="http://schemas.microsoft.com/office/word/2023/wordml/word16du" xmlns:w16sdtdh="http://schemas.microsoft.com/office/word/2020/wordml/sdtdatahash" xmlns:w16sdtfl="http://schemas.microsoft.com/office/word/2024/wordml/sdtformatlock" xmlns:w16se="http://schemas.microsoft.com/office/word/2015/wordml/symex" mc:Ignorable="w14 w15 w16se w16cid w16 w16cex w16sdtdh w16sdtfl w16du">
   <w:docDefaults>
     <w:rPrDefault>
       <w:rPr>
@@ -13340,9 +13288,10 @@
     <w:autoRedefine/>
     <w:uiPriority w:val="10"/>
     <w:qFormat/>
-    <w:rsid w:val="00485F35"/>
+    <w:rsid w:val="00E738A4"/>
     <w:pPr>
       <w:spacing w:beforeLines="200" w:before="480" w:afterLines="200" w:after="480" w:line="180" w:lineRule="auto"/>
+      <w:jc w:val="right"/>
     </w:pPr>
     <w:rPr>
       <w:rFonts w:ascii="Source Han Sans Normal" w:eastAsia="Source Han Sans Normal" w:hAnsi="Source Han Sans Normal" w:cs="Source Han Sans Normal"/>
@@ -14175,7 +14124,7 @@
     <w:uiPriority w:val="9"/>
     <w:rsid w:val="00A9252F"/>
     <w:rPr>
-      <w:rFonts w:ascii="Source Sans Pro" w:eastAsia="Source Han Code JP R" w:hAnsi="Source Sans Pro" w:cstheme="majorBidi"/>
+      <w:rFonts w:ascii="Source Sans Pro" w:eastAsia="源ノ角ゴシック Code JP R" w:hAnsi="Source Sans Pro" w:cstheme="majorBidi"/>
       <w:b/>
       <w:bCs/>
       <w:iCs/>
@@ -14230,7 +14179,7 @@
     <w:basedOn w:val="DefaultParagraphFont"/>
     <w:link w:val="Title"/>
     <w:uiPriority w:val="10"/>
-    <w:rsid w:val="00485F35"/>
+    <w:rsid w:val="00E738A4"/>
     <w:rPr>
       <w:rFonts w:ascii="Source Han Sans Normal" w:eastAsia="Source Han Sans Normal" w:hAnsi="Source Han Sans Normal" w:cs="Source Han Sans Normal"/>
       <w:color w:val="C00000"/>
@@ -14728,7 +14677,7 @@
       <w:jc w:val="center"/>
     </w:pPr>
     <w:rPr>
-      <w:rFonts w:ascii="Source Sans Pro" w:eastAsia="Source Han Code JP R" w:hAnsi="Source Sans Pro"/>
+      <w:rFonts w:ascii="Source Sans Pro" w:eastAsia="源ノ角ゴシック Code JP R" w:hAnsi="Source Sans Pro"/>
       <w:sz w:val="24"/>
       <w:szCs w:val="24"/>
     </w:rPr>
@@ -14748,7 +14697,7 @@
         <w:jc w:val="center"/>
       </w:pPr>
       <w:rPr>
-        <w:rFonts w:ascii="Source Sans Pro" w:eastAsia="Source Han Code JP R" w:hAnsi="Source Sans Pro"/>
+        <w:rFonts w:ascii="源ノ角ゴシック Code JP L" w:eastAsia="@源ノ角ゴシック Code JP L" w:hAnsi="源ノ角ゴシック Code JP L"/>
         <w:b/>
         <w:sz w:val="24"/>
       </w:rPr>
@@ -14781,7 +14730,7 @@
     <w:semiHidden/>
     <w:rsid w:val="00E57EAE"/>
     <w:rPr>
-      <w:rFonts w:ascii="Source Sans Pro" w:eastAsia="Source Han Code JP R" w:hAnsi="Source Sans Pro"/>
+      <w:rFonts w:ascii="Source Sans Pro" w:eastAsia="源ノ角ゴシック Code JP R" w:hAnsi="Source Sans Pro"/>
       <w:sz w:val="16"/>
     </w:rPr>
   </w:style>

</xml_diff>

<commit_message>
update local_reference.docx - header title font changed
</commit_message>
<xml_diff>
--- a/local_reference.docx
+++ b/local_reference.docx
@@ -1768,6 +1768,210 @@
     <w:p>
       <w:pPr>
         <w:pStyle w:val="BodyText"/>
+        <w:rPr>
+          <w:lang w:eastAsia="ja-JP"/>
+        </w:rPr>
+      </w:pPr>
+    </w:p>
+    <w:p>
+      <w:pPr>
+        <w:rPr>
+          <w:lang w:eastAsia="ja-JP"/>
+        </w:rPr>
+      </w:pPr>
+    </w:p>
+    <w:p>
+      <w:pPr>
+        <w:rPr>
+          <w:lang w:eastAsia="ja-JP"/>
+        </w:rPr>
+      </w:pPr>
+    </w:p>
+    <w:p>
+      <w:pPr>
+        <w:rPr>
+          <w:lang w:eastAsia="ja-JP"/>
+        </w:rPr>
+      </w:pPr>
+    </w:p>
+    <w:p>
+      <w:pPr>
+        <w:rPr>
+          <w:lang w:eastAsia="ja-JP"/>
+        </w:rPr>
+      </w:pPr>
+    </w:p>
+    <w:p>
+      <w:pPr>
+        <w:rPr>
+          <w:lang w:eastAsia="ja-JP"/>
+        </w:rPr>
+      </w:pPr>
+    </w:p>
+    <w:p>
+      <w:pPr>
+        <w:rPr>
+          <w:lang w:eastAsia="ja-JP"/>
+        </w:rPr>
+      </w:pPr>
+    </w:p>
+    <w:p>
+      <w:pPr>
+        <w:rPr>
+          <w:lang w:eastAsia="ja-JP"/>
+        </w:rPr>
+      </w:pPr>
+    </w:p>
+    <w:p>
+      <w:pPr>
+        <w:rPr>
+          <w:lang w:eastAsia="ja-JP"/>
+        </w:rPr>
+      </w:pPr>
+    </w:p>
+    <w:p>
+      <w:pPr>
+        <w:rPr>
+          <w:lang w:eastAsia="ja-JP"/>
+        </w:rPr>
+      </w:pPr>
+    </w:p>
+    <w:p>
+      <w:pPr>
+        <w:rPr>
+          <w:lang w:eastAsia="ja-JP"/>
+        </w:rPr>
+      </w:pPr>
+    </w:p>
+    <w:p>
+      <w:pPr>
+        <w:rPr>
+          <w:lang w:eastAsia="ja-JP"/>
+        </w:rPr>
+      </w:pPr>
+    </w:p>
+    <w:p>
+      <w:pPr>
+        <w:rPr>
+          <w:lang w:eastAsia="ja-JP"/>
+        </w:rPr>
+      </w:pPr>
+    </w:p>
+    <w:p>
+      <w:pPr>
+        <w:rPr>
+          <w:lang w:eastAsia="ja-JP"/>
+        </w:rPr>
+      </w:pPr>
+    </w:p>
+    <w:p>
+      <w:pPr>
+        <w:rPr>
+          <w:lang w:eastAsia="ja-JP"/>
+        </w:rPr>
+      </w:pPr>
+    </w:p>
+    <w:p>
+      <w:pPr>
+        <w:rPr>
+          <w:lang w:eastAsia="ja-JP"/>
+        </w:rPr>
+      </w:pPr>
+    </w:p>
+    <w:p>
+      <w:pPr>
+        <w:rPr>
+          <w:lang w:eastAsia="ja-JP"/>
+        </w:rPr>
+      </w:pPr>
+    </w:p>
+    <w:p>
+      <w:pPr>
+        <w:rPr>
+          <w:lang w:eastAsia="ja-JP"/>
+        </w:rPr>
+      </w:pPr>
+    </w:p>
+    <w:p>
+      <w:pPr>
+        <w:rPr>
+          <w:lang w:eastAsia="ja-JP"/>
+        </w:rPr>
+      </w:pPr>
+    </w:p>
+    <w:p>
+      <w:pPr>
+        <w:rPr>
+          <w:sz w:val="18"/>
+          <w:lang w:eastAsia="ja-JP"/>
+        </w:rPr>
+      </w:pPr>
+    </w:p>
+    <w:p>
+      <w:pPr>
+        <w:rPr>
+          <w:lang w:eastAsia="ja-JP"/>
+        </w:rPr>
+      </w:pPr>
+    </w:p>
+    <w:p>
+      <w:pPr>
+        <w:rPr>
+          <w:lang w:eastAsia="ja-JP"/>
+        </w:rPr>
+      </w:pPr>
+    </w:p>
+    <w:p>
+      <w:pPr>
+        <w:rPr>
+          <w:lang w:eastAsia="ja-JP"/>
+        </w:rPr>
+      </w:pPr>
+    </w:p>
+    <w:p>
+      <w:pPr>
+        <w:rPr>
+          <w:lang w:eastAsia="ja-JP"/>
+        </w:rPr>
+      </w:pPr>
+    </w:p>
+    <w:p>
+      <w:pPr>
+        <w:rPr>
+          <w:lang w:eastAsia="ja-JP"/>
+        </w:rPr>
+      </w:pPr>
+    </w:p>
+    <w:p>
+      <w:pPr>
+        <w:rPr>
+          <w:lang w:eastAsia="ja-JP"/>
+        </w:rPr>
+      </w:pPr>
+    </w:p>
+    <w:p>
+      <w:pPr>
+        <w:rPr>
+          <w:lang w:eastAsia="ja-JP"/>
+        </w:rPr>
+      </w:pPr>
+    </w:p>
+    <w:p>
+      <w:pPr>
+        <w:rPr>
+          <w:lang w:eastAsia="ja-JP"/>
+        </w:rPr>
+      </w:pPr>
+    </w:p>
+    <w:p>
+      <w:pPr>
+        <w:rPr>
+          <w:lang w:eastAsia="ja-JP"/>
+        </w:rPr>
+      </w:pPr>
+    </w:p>
+    <w:p>
+      <w:pPr>
         <w:rPr>
           <w:lang w:eastAsia="ja-JP"/>
         </w:rPr>
@@ -2548,7 +2752,6 @@
         <w:pStyle w:val="FeatureList1"/>
       </w:pPr>
       <w:r>
-        <w:lastRenderedPageBreak/>
         <w:t>&lt;Feature List 1&gt;</w:t>
       </w:r>
     </w:p>
@@ -3804,6 +4007,7 @@
         <w:rPr>
           <w:rStyle w:val="FloatTok"/>
         </w:rPr>
+        <w:lastRenderedPageBreak/>
         <w:t>FloatTok</w:t>
       </w:r>
       <w:proofErr w:type="spellEnd"/>
@@ -3815,7 +4019,6 @@
         <w:rPr>
           <w:rStyle w:val="FunctionTok"/>
         </w:rPr>
-        <w:lastRenderedPageBreak/>
         <w:t>FunctionTok</w:t>
       </w:r>
       <w:proofErr w:type="spellEnd"/>
@@ -5144,6 +5347,7 @@
         <w:rPr>
           <w:rStyle w:val="NormalTok"/>
         </w:rPr>
+        <w:lastRenderedPageBreak/>
         <w:tab/>
         <w:t xml:space="preserve">cd docs; </w:t>
       </w:r>
@@ -5160,7 +5364,6 @@
         <w:rPr>
           <w:rStyle w:val="NormalTok"/>
         </w:rPr>
-        <w:lastRenderedPageBreak/>
         <w:tab/>
         <w:t>make docx</w:t>
       </w:r>
@@ -6002,6 +6205,7 @@
         <w:br/>
       </w:r>
       <w:r>
+        <w:lastRenderedPageBreak/>
         <w:br/>
       </w:r>
       <w:r>
@@ -6023,7 +6227,6 @@
         <w:rPr>
           <w:rStyle w:val="NormalTok"/>
         </w:rPr>
-        <w:lastRenderedPageBreak/>
         <w:t xml:space="preserve">    </w:t>
       </w:r>
       <w:r>
@@ -6785,7 +6988,7 @@
         <w:noProof/>
         <w:color w:val="17365D" w:themeColor="text2" w:themeShade="BF"/>
       </w:rPr>
-      <w:instrText>14</w:instrText>
+      <w:instrText>8</w:instrText>
     </w:r>
     <w:r>
       <w:rPr>
@@ -6804,7 +7007,7 @@
         <w:noProof/>
         <w:color w:val="17365D" w:themeColor="text2" w:themeShade="BF"/>
       </w:rPr>
-      <w:instrText>14</w:instrText>
+      <w:instrText>8</w:instrText>
     </w:r>
     <w:r>
       <w:rPr>
@@ -6829,7 +7032,7 @@
         <w:noProof/>
         <w:color w:val="17365D" w:themeColor="text2" w:themeShade="BF"/>
       </w:rPr>
-      <w:t>14</w:t>
+      <w:t>8</w:t>
     </w:r>
     <w:r>
       <w:rPr>
@@ -6930,7 +7133,7 @@
         <w:noProof/>
         <w:color w:val="17365D" w:themeColor="text2" w:themeShade="BF"/>
       </w:rPr>
-      <w:instrText>15</w:instrText>
+      <w:instrText>7</w:instrText>
     </w:r>
     <w:r>
       <w:rPr>
@@ -6949,7 +7152,7 @@
         <w:noProof/>
         <w:color w:val="17365D" w:themeColor="text2" w:themeShade="BF"/>
       </w:rPr>
-      <w:instrText>15</w:instrText>
+      <w:instrText>7</w:instrText>
     </w:r>
     <w:r>
       <w:rPr>
@@ -6974,7 +7177,7 @@
         <w:noProof/>
         <w:color w:val="17365D" w:themeColor="text2" w:themeShade="BF"/>
       </w:rPr>
-      <w:t>15</w:t>
+      <w:t>7</w:t>
     </w:r>
     <w:r>
       <w:rPr>
@@ -7007,6 +7210,13 @@
           <w:cnfStyle w:val="000010000000" w:firstRow="0" w:lastRow="0" w:firstColumn="0" w:lastColumn="0" w:oddVBand="1" w:evenVBand="0" w:oddHBand="0" w:evenHBand="0" w:firstRowFirstColumn="0" w:firstRowLastColumn="0" w:lastRowFirstColumn="0" w:lastRowLastColumn="0"/>
           <w:tcW w:w="6941" w:type="dxa"/>
           <w:gridSpan w:val="2"/>
+          <w:tcBorders>
+            <w:top w:val="nil"/>
+            <w:left w:val="nil"/>
+            <w:bottom w:val="nil"/>
+            <w:right w:val="nil"/>
+          </w:tcBorders>
+          <w:shd w:val="clear" w:color="auto" w:fill="auto"/>
         </w:tcPr>
         <w:p>
           <w:pPr>
@@ -7029,6 +7239,13 @@
           <w:cnfStyle w:val="000010000000" w:firstRow="0" w:lastRow="0" w:firstColumn="0" w:lastColumn="0" w:oddVBand="1" w:evenVBand="0" w:oddHBand="0" w:evenHBand="0" w:firstRowFirstColumn="0" w:firstRowLastColumn="0" w:lastRowFirstColumn="0" w:lastRowLastColumn="0"/>
           <w:tcW w:w="6941" w:type="dxa"/>
           <w:gridSpan w:val="2"/>
+          <w:tcBorders>
+            <w:top w:val="nil"/>
+            <w:left w:val="nil"/>
+            <w:bottom w:val="nil"/>
+            <w:right w:val="nil"/>
+          </w:tcBorders>
+          <w:shd w:val="clear" w:color="auto" w:fill="auto"/>
         </w:tcPr>
         <w:p>
           <w:pPr>
@@ -7046,6 +7263,13 @@
           <w:cnfStyle w:val="000010000000" w:firstRow="0" w:lastRow="0" w:firstColumn="0" w:lastColumn="0" w:oddVBand="1" w:evenVBand="0" w:oddHBand="0" w:evenHBand="0" w:firstRowFirstColumn="0" w:firstRowLastColumn="0" w:lastRowFirstColumn="0" w:lastRowLastColumn="0"/>
           <w:tcW w:w="6941" w:type="dxa"/>
           <w:gridSpan w:val="2"/>
+          <w:tcBorders>
+            <w:top w:val="nil"/>
+            <w:left w:val="nil"/>
+            <w:bottom w:val="nil"/>
+            <w:right w:val="nil"/>
+          </w:tcBorders>
+          <w:shd w:val="clear" w:color="auto" w:fill="auto"/>
         </w:tcPr>
         <w:p>
           <w:pPr>
@@ -7094,6 +7318,13 @@
         <w:tcPr>
           <w:cnfStyle w:val="000010000000" w:firstRow="0" w:lastRow="0" w:firstColumn="0" w:lastColumn="0" w:oddVBand="1" w:evenVBand="0" w:oddHBand="0" w:evenHBand="0" w:firstRowFirstColumn="0" w:firstRowLastColumn="0" w:lastRowFirstColumn="0" w:lastRowLastColumn="0"/>
           <w:tcW w:w="5215" w:type="dxa"/>
+          <w:tcBorders>
+            <w:top w:val="nil"/>
+            <w:left w:val="nil"/>
+            <w:bottom w:val="nil"/>
+            <w:right w:val="nil"/>
+          </w:tcBorders>
+          <w:shd w:val="clear" w:color="auto" w:fill="auto"/>
         </w:tcPr>
         <w:p>
           <w:pPr>
@@ -7146,6 +7377,12 @@
       <w:tc>
         <w:tcPr>
           <w:tcW w:w="1726" w:type="dxa"/>
+          <w:tcBorders>
+            <w:top w:val="nil"/>
+            <w:left w:val="nil"/>
+            <w:bottom w:val="nil"/>
+            <w:right w:val="nil"/>
+          </w:tcBorders>
         </w:tcPr>
         <w:p>
           <w:pPr>
@@ -7240,48 +7477,34 @@
       <w:pStyle w:val="Header"/>
     </w:pPr>
     <w:r>
-      <w:rPr>
-        <w:rFonts w:asciiTheme="majorHAnsi" w:eastAsiaTheme="majorEastAsia" w:hAnsiTheme="majorHAnsi" w:cstheme="majorBidi"/>
-      </w:rPr>
       <w:fldChar w:fldCharType="begin"/>
     </w:r>
     <w:r>
-      <w:rPr>
-        <w:rFonts w:asciiTheme="majorHAnsi" w:eastAsiaTheme="majorEastAsia" w:hAnsiTheme="majorHAnsi" w:cstheme="majorBidi"/>
-      </w:rPr>
       <w:instrText xml:space="preserve"> </w:instrText>
     </w:r>
     <w:r>
       <w:rPr>
-        <w:rFonts w:asciiTheme="majorHAnsi" w:eastAsiaTheme="majorEastAsia" w:hAnsiTheme="majorHAnsi" w:cstheme="majorBidi"/>
         <w:lang w:eastAsia="ja-JP"/>
       </w:rPr>
       <w:instrText>DOCPROPERTY TITLE-META \* MERGEFORMAT</w:instrText>
     </w:r>
     <w:r>
       <w:rPr>
-        <w:rFonts w:asciiTheme="majorHAnsi" w:eastAsiaTheme="majorEastAsia" w:hAnsiTheme="majorHAnsi" w:cstheme="majorBidi" w:hint="eastAsia"/>
+        <w:rFonts w:hint="eastAsia"/>
         <w:lang w:eastAsia="ja-JP"/>
       </w:rPr>
       <w:instrText xml:space="preserve"> </w:instrText>
     </w:r>
     <w:r>
-      <w:rPr>
-        <w:rFonts w:asciiTheme="majorHAnsi" w:eastAsiaTheme="majorEastAsia" w:hAnsiTheme="majorHAnsi" w:cstheme="majorBidi"/>
-      </w:rPr>
       <w:fldChar w:fldCharType="separate"/>
     </w:r>
     <w:r>
       <w:rPr>
-        <w:rFonts w:asciiTheme="majorHAnsi" w:eastAsiaTheme="majorEastAsia" w:hAnsiTheme="majorHAnsi" w:cstheme="majorBidi"/>
         <w:lang w:eastAsia="ja-JP"/>
       </w:rPr>
       <w:t>本のタイトル</w:t>
     </w:r>
     <w:r>
-      <w:rPr>
-        <w:rFonts w:asciiTheme="majorHAnsi" w:eastAsiaTheme="majorEastAsia" w:hAnsiTheme="majorHAnsi" w:cstheme="majorBidi"/>
-      </w:rPr>
       <w:fldChar w:fldCharType="end"/>
     </w:r>
   </w:p>
@@ -7293,51 +7516,42 @@
   <w:p>
     <w:pPr>
       <w:pStyle w:val="Header"/>
-      <w:jc w:val="right"/>
     </w:pPr>
     <w:r>
       <w:rPr>
-        <w:rFonts w:asciiTheme="majorHAnsi" w:eastAsiaTheme="majorEastAsia" w:hAnsiTheme="majorHAnsi" w:cstheme="majorBidi"/>
-      </w:rPr>
+        <w:rFonts w:hint="eastAsia"/>
+      </w:rPr>
+      <w:ptab w:relativeTo="margin" w:alignment="right" w:leader="none"/>
+    </w:r>
+    <w:r>
       <w:fldChar w:fldCharType="begin"/>
     </w:r>
     <w:r>
-      <w:rPr>
-        <w:rFonts w:asciiTheme="majorHAnsi" w:eastAsiaTheme="majorEastAsia" w:hAnsiTheme="majorHAnsi" w:cstheme="majorBidi"/>
-      </w:rPr>
       <w:instrText xml:space="preserve"> </w:instrText>
     </w:r>
     <w:r>
       <w:rPr>
-        <w:rFonts w:asciiTheme="majorHAnsi" w:eastAsiaTheme="majorEastAsia" w:hAnsiTheme="majorHAnsi" w:cstheme="majorBidi"/>
         <w:lang w:eastAsia="ja-JP"/>
       </w:rPr>
       <w:instrText>DOCPROPERTY TITLE-META \* MERGEFORMAT</w:instrText>
     </w:r>
     <w:r>
       <w:rPr>
-        <w:rFonts w:asciiTheme="majorHAnsi" w:eastAsiaTheme="majorEastAsia" w:hAnsiTheme="majorHAnsi" w:cstheme="majorBidi" w:hint="eastAsia"/>
+        <w:rFonts w:hint="eastAsia"/>
         <w:lang w:eastAsia="ja-JP"/>
       </w:rPr>
       <w:instrText xml:space="preserve"> </w:instrText>
     </w:r>
     <w:r>
-      <w:rPr>
-        <w:rFonts w:asciiTheme="majorHAnsi" w:eastAsiaTheme="majorEastAsia" w:hAnsiTheme="majorHAnsi" w:cstheme="majorBidi"/>
-      </w:rPr>
       <w:fldChar w:fldCharType="separate"/>
     </w:r>
     <w:r>
       <w:rPr>
-        <w:rFonts w:asciiTheme="majorHAnsi" w:eastAsiaTheme="majorEastAsia" w:hAnsiTheme="majorHAnsi" w:cstheme="majorBidi"/>
         <w:lang w:eastAsia="ja-JP"/>
       </w:rPr>
       <w:t>本のタイトル</w:t>
     </w:r>
     <w:r>
-      <w:rPr>
-        <w:rFonts w:asciiTheme="majorHAnsi" w:eastAsiaTheme="majorEastAsia" w:hAnsiTheme="majorHAnsi" w:cstheme="majorBidi"/>
-      </w:rPr>
       <w:fldChar w:fldCharType="end"/>
     </w:r>
   </w:p>
@@ -14755,7 +14969,7 @@
     <w:uiPriority w:val="99"/>
     <w:unhideWhenUsed/>
     <w:qFormat/>
-    <w:rsid w:val="00485F35"/>
+    <w:rsid w:val="007C3962"/>
     <w:pPr>
       <w:tabs>
         <w:tab w:val="center" w:pos="4252"/>
@@ -14764,15 +14978,22 @@
       <w:snapToGrid w:val="0"/>
       <w:spacing w:after="120"/>
     </w:pPr>
+    <w:rPr>
+      <w:rFonts w:ascii="源ノ角ゴシック Code JP R" w:eastAsia="源ノ角ゴシック Code JP R" w:hAnsi="源ノ角ゴシック Code JP R" w:cs="源ノ角ゴシック Code JP R"/>
+      <w:spacing w:val="-20"/>
+      <w:position w:val="6"/>
+    </w:rPr>
   </w:style>
   <w:style w:type="character" w:customStyle="1" w:styleId="HeaderChar">
     <w:name w:val="Header Char"/>
     <w:basedOn w:val="DefaultParagraphFont"/>
     <w:link w:val="Header"/>
     <w:uiPriority w:val="99"/>
-    <w:rsid w:val="00485F35"/>
+    <w:rsid w:val="007C3962"/>
     <w:rPr>
-      <w:rFonts w:ascii="Source Han Sans Regular" w:eastAsia="Source Han Sans Regular" w:hAnsi="Source Han Sans Regular" w:cs="Source Han Sans Regular"/>
+      <w:rFonts w:ascii="源ノ角ゴシック Code JP R" w:eastAsia="源ノ角ゴシック Code JP R" w:hAnsi="源ノ角ゴシック Code JP R" w:cs="源ノ角ゴシック Code JP R"/>
+      <w:spacing w:val="-20"/>
+      <w:position w:val="6"/>
       <w:sz w:val="20"/>
       <w:szCs w:val="20"/>
     </w:rPr>

</xml_diff>